<commit_message>
fix(p5/p7): add Haans et al. (2016) 4-condition LM block; fix P7 TP formula
P5 §4.2: explicit C1–C4 Haans/Lind-Mehlum conditions for both 2012 and
2024 waves (β₁>0, β₂<0, TP in range, slopes opposite-signed at bounds).

P7 §3.3: corrected TP formula from TP=−β₁/(2β₂)×SD+mean (wrong, applies
to z-standardised FSTS) to TP=−β₁/(2β₂)+mean(FSTS) (correct for
mean-centred FSTS_c). §4.2: added Haans C1–C4 block for M2 baseline
(β₁=+1.316, β₂=−1.810, TP=36.4%, LM p<.001, slopes positive at 0% and
negative at 100% FSTS).

P3 JABS package: README word count corrected 247→250; blinded docx
rebuilt from updated abstract.

https://claude.ai/code/session_01GMFmEtt6FYiJ4MKzBNCLqb
</commit_message>
<xml_diff>
--- a/p3/submission/jabs_package/01_manuscript_blinded.docx
+++ b/p3/submission/jabs_package/01_manuscript_blinded.docx
@@ -112,7 +112,7 @@
         <w:pStyle w:val="BodyText"/>
       </w:pPr>
       <w:r>
-        <w:t xml:space="preserve">Design/methodology/approach — Three waves of World Bank Enterprise Survey data (Vietnam 2009, 2015, 2023; N = 2,958) are used to estimate wave-specific and pooled OLS models with HC1 robust standard errors, quadratic export-intensity terms, and capability interactions. TCI (quality certification, foreign-licensed technology) is the primary construct; a single-item website indicator (Tier-1 only) is retained as a digital-presence control.</w:t>
+        <w:t xml:space="preserve">Design/methodology/approach — Three waves of World Bank Enterprise Survey data (Vietnam 2009, 2015, 2023; N = 2,958) underpin wave-specific and pooled OLS models with HC1 standard errors, quadratic export-intensity terms, and capability interactions. TCI (quality certification, foreign-licensed technology) is the primary construct; a single-item website indicator (Tier-1 only) is retained as a digital-presence control.</w:t>
       </w:r>
     </w:p>
     <w:p>
@@ -120,7 +120,7 @@
         <w:pStyle w:val="BodyText"/>
       </w:pPr>
       <w:r>
-        <w:t xml:space="preserve">Findings — An inverted-U between export intensity and labour productivity holds across all three waves, with turning points clustered between 39% and 46% — a structurally durable 7-percentage-point band sustained across 14 years of institutional change. The nonlinearity is primarily a participation-margin effect (participation-margin effect — the productivity premium from switching from non-exporter to exporter status, distinct from the intensive margin of increasing export intensity among active exporters; Helpman, Melitz &amp; Yeaple, 2004): re-estimated on the exporter-only sub-sample, the quadratic term loses statistical significance (β = −0.200, p = .660), and fewer than 1% of pooled firms lie within ±5 percentage points of the turning point. TCI is positively associated with productivity in all waves (pooled β = 0.179, p &lt; .001) and moderates the I–P curvature. The website indicator follows a Tier-1 proxy-obsolescence trajectory: positive in 2009, null in 2015, and negatively interactive with export intensity in 2023.</w:t>
+        <w:t xml:space="preserve">Findings — An inverted-U between export intensity and labour productivity holds across all three waves, with turning points clustered between 39% and 46% — a durable 7-percentage-point band across 14 years of institutional change. The nonlinearity reflects a participation-margin effect (Helpman, Melitz &amp; Yeaple, 2004): re-estimated on the exporter-only sub-sample, the quadratic term loses significance (β = −0.200, p = .660). TCI is positively associated with productivity in all waves (pooled β = 0.179, p &lt; .001) and moderates the I–P curvature. The website indicator follows a Tier-1 proxy-obsolescence trajectory: positive in 2009, null in 2015, and negatively interactive with export intensity in 2023.</w:t>
       </w:r>
     </w:p>
     <w:p>
@@ -128,7 +128,7 @@
         <w:pStyle w:val="BodyText"/>
       </w:pPr>
       <w:r>
-        <w:t xml:space="preserve">Originality/value — The study shows that the conventional inverted-U in zero-inflated emerging-market settings reflects a performance gap at the export-participation barrier rather than a continuous intensity-saturation curve, and shows that pooled digital coefficients on a Tier-1 binary mask progressive proxy obsolescence. The evidence that the inverted-U threshold cluster (39–46% FSTS band) is institutionally embedded rather than firm-specific shifts the debate from 'does internationalization help?' to 'under what institutional conditions does the threshold shift?'</w:t>
+        <w:t xml:space="preserve">Originality/value — The study shows that the conventional inverted-U in zero-inflated emerging-market settings reflects a performance gap at the export-participation barrier rather than a continuous intensity-saturation curve; pooled digital coefficients on a Tier-1 binary mask progressive proxy obsolescence. The evidence that the threshold cluster (39–46% FSTS band) is institutionally embedded rather than firm-specific shifts the debate from 'does internationalization help?' to 'under what institutional conditions does the threshold shift?'</w:t>
       </w:r>
     </w:p>
     <w:p>
@@ -4401,11 +4401,486 @@
         <w:pStyle w:val="FirstParagraph"/>
       </w:pPr>
       <w:r>
-        <w:t xml:space="preserve">The pooled estimates confirm that the internationalisation–performance relationship is nonlinear on average. In the pooled M2 specification, the linear FSTS_c term is positive (β = 0.984, p &lt; .001) and the quadratic FSTS_c² term is negative (β = -1.909, p &lt; .001); the Lind–Mehlum test rejects monotonicity at p &lt; .001 with an estimated turning point at 39.7 per cent of direct-export intensity. The curvature persists in the full M8 specification (FSTS_c β = 0.845, p = .006; FSTS_c² β = -1.650, p &lt; .001); the positive linear and negative quadratic coefficients together confirm the inverted-U, consistent with H1 and aligning with the meta-analytic evidence on the nonlinear shape of internationalisation returns in emerging-market firms (Marano et al., 2016).</w:t>
-      </w:r>
-      <w:r>
-        <w:t xml:space="preserve"> </w:t>
-      </w:r>
+        <w:t xml:space="preserve">The pooled estimates confirm that the internationalisation–performance relationship is nonlinear on average. In the pooled M2 specification, the linear FSTS_c term is positive (β = 0.984, p &lt; .001) and the quadratic FSTS_c² term is negative (β = -1.909, p &lt; .001); the Lind–Mehlum test rejects monotonicity at p &lt; .001 with an estimated turning point at 39.7 per cent of direct-export intensity. Following Haans, Pieters, and He (2016), all four formal conditions for a genuine inverted-U are met: (C1) β₁ = +0.984 (p &lt; .001), confirming a positive ascending limb; (C2) β₂ = −1.909 (p &lt; .001), confirming concavity; (C3) TP* = −β₁/(2β₂) = 39.7% falls within the observed FSTS range [0%, 100%]; and (C4) the predicted marginal return of internationalisation is positive at the lower data bound (FSTS = 0%, slope ≈ +1.52) and negative at the upper data bound (FSTS = 100%, slope ≈ −2.30), with opposite signs confirmed by the Lind–Mehlum (2010) u-test (p &lt; .001 binding). The curvature persists in the full M8 specification (FSTS_c β = 0.845, p = .006; FSTS_c² β = -1.650, p &lt; .001); the positive linear and negative quadratic coefficients together confirm the inverted-U, consistent with H1 and aligning with the meta-analytic evidence on the nonlinear shape of internationalisation returns in emerging-market firms (Marano et al., 2016).</w:t>
+      </w:r>
+      <w:r>
+        <w:t xml:space="preserve"> </w:t>
+      </w:r>
+      <w:r>
+        <w:rPr>
+          <w:iCs/>
+          <w:i/>
+        </w:rPr>
+        <w:t xml:space="preserve">Table 4b — Marginal effect of internationalisation on ln(labour productivity) at selected FSTS values (pooled M2, N = 2,958)</w:t>
+      </w:r>
+    </w:p>
+    <w:tbl>
+      <w:tblPr>
+        <w:tblStyle w:val="Table"/>
+        <w:tblW w:type="auto" w:w="0"/>
+        <w:tblLook w:firstRow="1" w:lastRow="0" w:firstColumn="0" w:lastColumn="0" w:noHBand="0" w:noVBand="0" w:val="0020"/>
+        <w:jc w:val="start"/>
+      </w:tblPr>
+      <w:tblGrid>
+        <w:gridCol w:w="1980"/>
+        <w:gridCol w:w="1980"/>
+        <w:gridCol w:w="1980"/>
+        <w:gridCol w:w="1980"/>
+      </w:tblGrid>
+      <w:tr>
+        <w:trPr>
+          <w:tblHeader w:val="true"/>
+        </w:trPr>
+        <w:tc>
+          <w:tcPr/>
+          <w:p>
+            <w:pPr>
+              <w:pStyle w:val="Compact"/>
+              <w:jc w:val="left"/>
+            </w:pPr>
+            <w:r>
+              <w:t xml:space="preserve">FSTS level</w:t>
+            </w:r>
+          </w:p>
+        </w:tc>
+        <w:tc>
+          <w:tcPr/>
+          <w:p>
+            <w:pPr>
+              <w:pStyle w:val="Compact"/>
+              <w:jc w:val="left"/>
+            </w:pPr>
+            <w:r>
+              <w:t xml:space="preserve">FSTSc (centred)</w:t>
+            </w:r>
+          </w:p>
+        </w:tc>
+        <w:tc>
+          <w:tcPr/>
+          <w:p>
+            <w:pPr>
+              <w:pStyle w:val="Compact"/>
+              <w:jc w:val="left"/>
+            </w:pPr>
+            <w:r>
+              <w:t xml:space="preserve">Marginal effect dy/dFSTS</w:t>
+            </w:r>
+          </w:p>
+        </w:tc>
+        <w:tc>
+          <w:tcPr/>
+          <w:p>
+            <w:pPr>
+              <w:pStyle w:val="Compact"/>
+              <w:jc w:val="left"/>
+            </w:pPr>
+            <w:r>
+              <w:t xml:space="preserve">Direction</w:t>
+            </w:r>
+          </w:p>
+        </w:tc>
+      </w:tr>
+      <w:tr>
+        <w:tc>
+          <w:tcPr/>
+          <w:p>
+            <w:pPr>
+              <w:pStyle w:val="Compact"/>
+              <w:jc w:val="left"/>
+            </w:pPr>
+            <w:r>
+              <w:t xml:space="preserve">10%</w:t>
+            </w:r>
+          </w:p>
+        </w:tc>
+        <w:tc>
+          <w:tcPr/>
+          <w:p>
+            <w:pPr>
+              <w:pStyle w:val="Compact"/>
+              <w:jc w:val="left"/>
+            </w:pPr>
+            <w:r>
+              <w:t xml:space="preserve">−0.039</w:t>
+            </w:r>
+          </w:p>
+        </w:tc>
+        <w:tc>
+          <w:tcPr/>
+          <w:p>
+            <w:pPr>
+              <w:pStyle w:val="Compact"/>
+              <w:jc w:val="left"/>
+            </w:pPr>
+            <w:r>
+              <w:t xml:space="preserve">+1.13</w:t>
+            </w:r>
+          </w:p>
+        </w:tc>
+        <w:tc>
+          <w:tcPr/>
+          <w:p>
+            <w:pPr>
+              <w:pStyle w:val="Compact"/>
+              <w:jc w:val="left"/>
+            </w:pPr>
+            <w:r>
+              <w:t xml:space="preserve">Positive (ascending)</w:t>
+            </w:r>
+          </w:p>
+        </w:tc>
+      </w:tr>
+      <w:tr>
+        <w:tc>
+          <w:tcPr/>
+          <w:p>
+            <w:pPr>
+              <w:pStyle w:val="Compact"/>
+              <w:jc w:val="left"/>
+            </w:pPr>
+            <w:r>
+              <w:t xml:space="preserve">20%</w:t>
+            </w:r>
+          </w:p>
+        </w:tc>
+        <w:tc>
+          <w:tcPr/>
+          <w:p>
+            <w:pPr>
+              <w:pStyle w:val="Compact"/>
+              <w:jc w:val="left"/>
+            </w:pPr>
+            <w:r>
+              <w:t xml:space="preserve">+0.061</w:t>
+            </w:r>
+          </w:p>
+        </w:tc>
+        <w:tc>
+          <w:tcPr/>
+          <w:p>
+            <w:pPr>
+              <w:pStyle w:val="Compact"/>
+              <w:jc w:val="left"/>
+            </w:pPr>
+            <w:r>
+              <w:t xml:space="preserve">+0.75</w:t>
+            </w:r>
+          </w:p>
+        </w:tc>
+        <w:tc>
+          <w:tcPr/>
+          <w:p>
+            <w:pPr>
+              <w:pStyle w:val="Compact"/>
+              <w:jc w:val="left"/>
+            </w:pPr>
+            <w:r>
+              <w:t xml:space="preserve">Positive (ascending)</w:t>
+            </w:r>
+          </w:p>
+        </w:tc>
+      </w:tr>
+      <w:tr>
+        <w:tc>
+          <w:tcPr/>
+          <w:p>
+            <w:pPr>
+              <w:pStyle w:val="Compact"/>
+              <w:jc w:val="left"/>
+            </w:pPr>
+            <w:r>
+              <w:t xml:space="preserve">30%</w:t>
+            </w:r>
+          </w:p>
+        </w:tc>
+        <w:tc>
+          <w:tcPr/>
+          <w:p>
+            <w:pPr>
+              <w:pStyle w:val="Compact"/>
+              <w:jc w:val="left"/>
+            </w:pPr>
+            <w:r>
+              <w:t xml:space="preserve">+0.161</w:t>
+            </w:r>
+          </w:p>
+        </w:tc>
+        <w:tc>
+          <w:tcPr/>
+          <w:p>
+            <w:pPr>
+              <w:pStyle w:val="Compact"/>
+              <w:jc w:val="left"/>
+            </w:pPr>
+            <w:r>
+              <w:t xml:space="preserve">+0.37</w:t>
+            </w:r>
+          </w:p>
+        </w:tc>
+        <w:tc>
+          <w:tcPr/>
+          <w:p>
+            <w:pPr>
+              <w:pStyle w:val="Compact"/>
+              <w:jc w:val="left"/>
+            </w:pPr>
+            <w:r>
+              <w:t xml:space="preserve">Positive, declining</w:t>
+            </w:r>
+          </w:p>
+        </w:tc>
+      </w:tr>
+      <w:tr>
+        <w:tc>
+          <w:tcPr/>
+          <w:p>
+            <w:pPr>
+              <w:pStyle w:val="Compact"/>
+              <w:jc w:val="left"/>
+            </w:pPr>
+            <w:r>
+              <w:rPr>
+                <w:bCs/>
+                <w:b/>
+              </w:rPr>
+              <w:t xml:space="preserve">39.7%</w:t>
+            </w:r>
+          </w:p>
+        </w:tc>
+        <w:tc>
+          <w:tcPr/>
+          <w:p>
+            <w:pPr>
+              <w:pStyle w:val="Compact"/>
+              <w:jc w:val="left"/>
+            </w:pPr>
+            <w:r>
+              <w:rPr>
+                <w:bCs/>
+                <w:b/>
+              </w:rPr>
+              <w:t xml:space="preserve">+0.258</w:t>
+            </w:r>
+          </w:p>
+        </w:tc>
+        <w:tc>
+          <w:tcPr/>
+          <w:p>
+            <w:pPr>
+              <w:pStyle w:val="Compact"/>
+              <w:jc w:val="left"/>
+            </w:pPr>
+            <w:r>
+              <w:rPr>
+                <w:bCs/>
+                <w:b/>
+              </w:rPr>
+              <w:t xml:space="preserve">0.00</w:t>
+            </w:r>
+          </w:p>
+        </w:tc>
+        <w:tc>
+          <w:tcPr/>
+          <w:p>
+            <w:pPr>
+              <w:pStyle w:val="Compact"/>
+              <w:jc w:val="left"/>
+            </w:pPr>
+            <w:r>
+              <w:rPr>
+                <w:iCs/>
+                <w:i/>
+                <w:iCs/>
+                <w:i/>
+              </w:rPr>
+              <w:t xml:space="preserve">Turning point (TP</w:t>
+            </w:r>
+            <w:r>
+              <w:rPr>
+                <w:iCs/>
+                <w:i/>
+              </w:rPr>
+              <w:t xml:space="preserve">)</w:t>
+            </w:r>
+            <w:r>
+              <w:t xml:space="preserve">*</w:t>
+            </w:r>
+          </w:p>
+        </w:tc>
+      </w:tr>
+      <w:tr>
+        <w:tc>
+          <w:tcPr/>
+          <w:p>
+            <w:pPr>
+              <w:pStyle w:val="Compact"/>
+              <w:jc w:val="left"/>
+            </w:pPr>
+            <w:r>
+              <w:t xml:space="preserve">50%</w:t>
+            </w:r>
+          </w:p>
+        </w:tc>
+        <w:tc>
+          <w:tcPr/>
+          <w:p>
+            <w:pPr>
+              <w:pStyle w:val="Compact"/>
+              <w:jc w:val="left"/>
+            </w:pPr>
+            <w:r>
+              <w:t xml:space="preserve">+0.361</w:t>
+            </w:r>
+          </w:p>
+        </w:tc>
+        <w:tc>
+          <w:tcPr/>
+          <w:p>
+            <w:pPr>
+              <w:pStyle w:val="Compact"/>
+              <w:jc w:val="left"/>
+            </w:pPr>
+            <w:r>
+              <w:t xml:space="preserve">−0.39</w:t>
+            </w:r>
+          </w:p>
+        </w:tc>
+        <w:tc>
+          <w:tcPr/>
+          <w:p>
+            <w:pPr>
+              <w:pStyle w:val="Compact"/>
+              <w:jc w:val="left"/>
+            </w:pPr>
+            <w:r>
+              <w:t xml:space="preserve">Negative (descending)</w:t>
+            </w:r>
+          </w:p>
+        </w:tc>
+      </w:tr>
+      <w:tr>
+        <w:tc>
+          <w:tcPr/>
+          <w:p>
+            <w:pPr>
+              <w:pStyle w:val="Compact"/>
+              <w:jc w:val="left"/>
+            </w:pPr>
+            <w:r>
+              <w:t xml:space="preserve">60%</w:t>
+            </w:r>
+          </w:p>
+        </w:tc>
+        <w:tc>
+          <w:tcPr/>
+          <w:p>
+            <w:pPr>
+              <w:pStyle w:val="Compact"/>
+              <w:jc w:val="left"/>
+            </w:pPr>
+            <w:r>
+              <w:t xml:space="preserve">+0.461</w:t>
+            </w:r>
+          </w:p>
+        </w:tc>
+        <w:tc>
+          <w:tcPr/>
+          <w:p>
+            <w:pPr>
+              <w:pStyle w:val="Compact"/>
+              <w:jc w:val="left"/>
+            </w:pPr>
+            <w:r>
+              <w:t xml:space="preserve">−0.78</w:t>
+            </w:r>
+          </w:p>
+        </w:tc>
+        <w:tc>
+          <w:tcPr/>
+          <w:p>
+            <w:pPr>
+              <w:pStyle w:val="Compact"/>
+              <w:jc w:val="left"/>
+            </w:pPr>
+            <w:r>
+              <w:t xml:space="preserve">Negative</w:t>
+            </w:r>
+          </w:p>
+        </w:tc>
+      </w:tr>
+      <w:tr>
+        <w:tc>
+          <w:tcPr/>
+          <w:p>
+            <w:pPr>
+              <w:pStyle w:val="Compact"/>
+              <w:jc w:val="left"/>
+            </w:pPr>
+            <w:r>
+              <w:t xml:space="preserve">70%</w:t>
+            </w:r>
+          </w:p>
+        </w:tc>
+        <w:tc>
+          <w:tcPr/>
+          <w:p>
+            <w:pPr>
+              <w:pStyle w:val="Compact"/>
+              <w:jc w:val="left"/>
+            </w:pPr>
+            <w:r>
+              <w:t xml:space="preserve">+0.561</w:t>
+            </w:r>
+          </w:p>
+        </w:tc>
+        <w:tc>
+          <w:tcPr/>
+          <w:p>
+            <w:pPr>
+              <w:pStyle w:val="Compact"/>
+              <w:jc w:val="left"/>
+            </w:pPr>
+            <w:r>
+              <w:t xml:space="preserve">−1.16</w:t>
+            </w:r>
+          </w:p>
+        </w:tc>
+        <w:tc>
+          <w:tcPr/>
+          <w:p>
+            <w:pPr>
+              <w:pStyle w:val="Compact"/>
+              <w:jc w:val="left"/>
+            </w:pPr>
+            <w:r>
+              <w:t xml:space="preserve">Negative</w:t>
+            </w:r>
+          </w:p>
+        </w:tc>
+      </w:tr>
+    </w:tbl>
+    <w:p>
+      <w:pPr>
+        <w:pStyle w:val="BodyText"/>
+      </w:pPr>
+      <w:r>
+        <w:rPr>
+          <w:iCs/>
+          <w:i/>
+        </w:rPr>
+        <w:t xml:space="preserve">Note:</w:t>
+      </w:r>
+      <w:r>
+        <w:t xml:space="preserve"> </w:t>
+      </w:r>
+      <w:r>
+        <w:t xml:space="preserve">Marginal effect = β₁ + 2β₂ × (FSTS − mean_FSTS) where β₁ = 0.984, β₂ = −1.909, mean_FSTS ≈ 13.9%. SEs omitted pending full covariance matrix; the Lind–Mehlum u-test (p &lt; .001) confirms that slopes at the data boundaries (FSTS=0: +1.52; FSTS=100%: −2.30) are jointly inconsistent with monotonicity.</w:t>
+      </w:r>
+    </w:p>
+    <w:p>
+      <w:pPr>
+        <w:pStyle w:val="BodyText"/>
+      </w:pPr>
       <w:r>
         <w:t xml:space="preserve">The pooled evidence shows that both technological capability and basic digital adoption are positively associated with firm performance on average. In the pooled M7 dual-direct specification, TCI_z is positive (β = 0.179, p &lt; .001), and DAI_z is positive and significant (β = 0.078, p = .004). In the full M8 specification, the TCI_z coefficient is essentially unchanged (β = 0.184, p &lt; .001), while the DAI_z direct coefficient becomes statistically indistinguishable from zero (β = 0.032, p = .537) once the interaction terms are entered.</w:t>
       </w:r>
@@ -5311,6 +5786,14 @@
       <w:r>
         <w:t xml:space="preserve"> </w:t>
       </w:r>
+      <w:r>
+        <w:t xml:space="preserve">Functional form check — cubic extension. To test whether an S-curve (cubic) specification better captures the I–P pattern, we augment the pooled M2 with a cubic term FSTS_c³. The cubic coefficient is not statistically significant (β = −1.763, p = .287), and model-fit criteria favour the quadratic: AIC decreases by 0.99 and BIC decreases by 7.0 when moving from the cubic back to the quadratic specification. The cubic term does not alter the turning-point estimate or any focal coefficient substantively. The simpler inverted-U (M2) is therefore preferred over the S-curve on both inferential and parsimony grounds.</w:t>
+      </w:r>
+    </w:p>
+    <w:p>
+      <w:pPr>
+        <w:pStyle w:val="BodyText"/>
+      </w:pPr>
       <w:r>
         <w:t xml:space="preserve">Density-around-turning-point check. We also report the within-sample mass of firms in the curvature zone. Defining a ±5 percentage-point band around the wave-specific turning point (TP), the share of firms with FSTS within the band is 0.6 % (6 of 989) in 2009, 1.2 % (11 of</w:t>
       </w:r>

</xml_diff>

<commit_message>
build(submission): rebuild all 6 blinded journal manuscripts from corrected sources
Regenerated 01_manuscript_blinded.docx for P3(JABS)/P4(MIR)/P5(IJOEM)/P6(IBR)/
P7(JIBS)/P8(WorldDev) via pandoc, stripping author bylines/ORCID/target-journal
lines. Verified blinded (no author names) + corrections present:
  P3: 5 added refs (Barney etc.); P4: turning point 82%; P5: M6 equation
  LaTeX fixed; P7: M10 coefs + 49 economies + 82%; P8: Table 1 filled + ~33%.

https://claude.ai/code/session_01GMFmEtt6FYiJ4MKzBNCLqb
</commit_message>
<xml_diff>
--- a/p3/submission/jabs_package/01_manuscript_blinded.docx
+++ b/p3/submission/jabs_package/01_manuscript_blinded.docx
@@ -2,7 +2,7 @@
 <file path=word/document.xml><?xml version="1.0" encoding="utf-8"?>
 <w:document xmlns:w="http://schemas.openxmlformats.org/wordprocessingml/2006/main" xmlns:m="http://schemas.openxmlformats.org/officeDocument/2006/math" xmlns:r="http://schemas.openxmlformats.org/officeDocument/2006/relationships" xmlns:o="urn:schemas-microsoft-com:office:office" xmlns:v="urn:schemas-microsoft-com:vml" xmlns:w10="urn:schemas-microsoft-com:office:word" xmlns:a="http://schemas.openxmlformats.org/drawingml/2006/main" xmlns:pic="http://schemas.openxmlformats.org/drawingml/2006/picture" xmlns:wp="http://schemas.openxmlformats.org/drawingml/2006/wordprocessingDrawing">
   <w:body>
-    <w:bookmarkStart w:id="114" w:name="X0264dbef037d515bdd41c0931e5e2e7c8717b18"/>
+    <w:bookmarkStart w:id="134" w:name="X0264dbef037d515bdd41c0931e5e2e7c8717b18"/>
     <w:p>
       <w:pPr>
         <w:pStyle w:val="Heading1"/>
@@ -14,106 +14,6 @@
     <w:p>
       <w:pPr>
         <w:pStyle w:val="FirstParagraph"/>
-      </w:pPr>
-      <w:r>
-        <w:rPr>
-          <w:bCs/>
-          <w:b/>
-        </w:rPr>
-        <w:t xml:space="preserve">Do Thuy Huong</w:t>
-      </w:r>
-      <w:r>
-        <w:t xml:space="preserve"> </w:t>
-      </w:r>
-      <w:r>
-        <w:t xml:space="preserve">· College of Economics, Can Tho University ·</w:t>
-      </w:r>
-      <w:r>
-        <w:t xml:space="preserve"> </w:t>
-      </w:r>
-      <w:hyperlink r:id="rId20">
-        <w:r>
-          <w:rPr>
-            <w:rStyle w:val="Hyperlink"/>
-          </w:rPr>
-          <w:t xml:space="preserve">huongp1323001@gstudent.ctu.edu.vn</w:t>
-        </w:r>
-      </w:hyperlink>
-      <w:r>
-        <w:t xml:space="preserve"> </w:t>
-      </w:r>
-      <w:r>
-        <w:t xml:space="preserve">· ORCID:</w:t>
-      </w:r>
-      <w:r>
-        <w:t xml:space="preserve"> </w:t>
-      </w:r>
-      <w:hyperlink r:id="rId21">
-        <w:r>
-          <w:rPr>
-            <w:rStyle w:val="Hyperlink"/>
-          </w:rPr>
-          <w:t xml:space="preserve">0000-0002-7711-2487</w:t>
-        </w:r>
-      </w:hyperlink>
-      <w:r>
-        <w:br/>
-      </w:r>
-      <w:r>
-        <w:rPr>
-          <w:bCs/>
-          <w:b/>
-        </w:rPr>
-        <w:t xml:space="preserve">Phan Anh Tu</w:t>
-      </w:r>
-      <w:r>
-        <w:t xml:space="preserve"> </w:t>
-      </w:r>
-      <w:r>
-        <w:rPr>
-          <w:iCs/>
-          <w:i/>
-        </w:rPr>
-        <w:t xml:space="preserve">(Corresponding author)</w:t>
-      </w:r>
-      <w:r>
-        <w:t xml:space="preserve"> </w:t>
-      </w:r>
-      <w:r>
-        <w:t xml:space="preserve">· College of Economics, Can Tho University ·</w:t>
-      </w:r>
-      <w:r>
-        <w:t xml:space="preserve"> </w:t>
-      </w:r>
-      <w:hyperlink r:id="rId22">
-        <w:r>
-          <w:rPr>
-            <w:rStyle w:val="Hyperlink"/>
-          </w:rPr>
-          <w:t xml:space="preserve">patu@ctu.edu.vn</w:t>
-        </w:r>
-      </w:hyperlink>
-      <w:r>
-        <w:t xml:space="preserve"> </w:t>
-      </w:r>
-      <w:r>
-        <w:t xml:space="preserve">· ORCID:</w:t>
-      </w:r>
-      <w:r>
-        <w:t xml:space="preserve"> </w:t>
-      </w:r>
-      <w:hyperlink r:id="rId23">
-        <w:r>
-          <w:rPr>
-            <w:rStyle w:val="Hyperlink"/>
-          </w:rPr>
-          <w:t xml:space="preserve">0000-0003-0667-3137</w:t>
-        </w:r>
-      </w:hyperlink>
-    </w:p>
-    <w:p>
-      <w:pPr>
-        <w:pStyle w:val="BodyText"/>
       </w:pPr>
       <w:r>
         <w:rPr>
@@ -190,7 +90,7 @@
         </w:pict>
       </w:r>
     </w:p>
-    <w:bookmarkStart w:id="24" w:name="abstract"/>
+    <w:bookmarkStart w:id="20" w:name="abstract"/>
     <w:p>
       <w:pPr>
         <w:pStyle w:val="Heading2"/>
@@ -212,7 +112,7 @@
         <w:pStyle w:val="BodyText"/>
       </w:pPr>
       <w:r>
-        <w:t xml:space="preserve">Design/methodology/approach — Three waves of World Bank Enterprise Survey data (Vietnam 2009, 2015, 2023; N = 2,958) underpin wave-specific and pooled OLS models with HC1 standard errors, quadratic export-intensity terms, and capability interactions. TCI (quality certification, foreign-licensed technology) is the primary construct; a single-item website indicator (Tier-1 only) is retained as a digital-presence control.</w:t>
+        <w:t xml:space="preserve">Design/methodology/approach — Three waves of World Bank Enterprise Survey (Vietnam 2009, 2015, 2023; N = 2,958) underpin wave-specific and pooled OLS models with HC1 standard errors, quadratic FSTS terms, and capability interactions. TCI (quality certification, foreign-licensed technology) is the primary construct; a Tier-1 website indicator serves as digital-presence control.</w:t>
       </w:r>
     </w:p>
     <w:p>
@@ -220,7 +120,7 @@
         <w:pStyle w:val="BodyText"/>
       </w:pPr>
       <w:r>
-        <w:t xml:space="preserve">Findings — An inverted-U between export intensity and labour productivity holds across all three waves, with turning points clustered between 39% and 46% — a durable 7-percentage-point band across 14 years of institutional change. The nonlinearity reflects a participation-margin effect (Helpman, Melitz &amp; Yeaple, 2004): re-estimated on the exporter-only sub-sample, the quadratic term loses significance (β = −0.200, p = .660). TCI is positively associated with productivity in all waves (pooled β = 0.179, p &lt; .001) and moderates the I–P curvature. The website indicator follows a Tier-1 proxy-obsolescence trajectory: positive in 2009, null in 2015, and negatively interactive with export intensity in 2023.</w:t>
+        <w:t xml:space="preserve">Findings — An inverted-U between export intensity and labour productivity holds across all three waves, with turning points clustered between 39% and 46% — a durable band over 14 years. The nonlinearity reflects a participation-margin effect: on exporters only, the quadratic term loses significance. TCI positively moderates productivity and the I–P curvature across waves. The website indicator follows a proxy-obsolescence trajectory: positive in 2009, null in 2015, negatively interactive in 2023.</w:t>
       </w:r>
     </w:p>
     <w:p>
@@ -228,7 +128,7 @@
         <w:pStyle w:val="BodyText"/>
       </w:pPr>
       <w:r>
-        <w:t xml:space="preserve">Originality/value — The study finds that the conventional inverted-U in zero-inflated emerging-market settings reflects a performance gap at the export-participation barrier rather than a continuous intensity-saturation curve; pooled digital coefficients on a Tier-1 binary mask progressive proxy obsolescence. The evidence that the threshold cluster (39–46% FSTS band) is institutionally embedded rather than firm-specific shifts the debate from 'does internationalization help?' to 'under what institutional conditions does the threshold shift?'</w:t>
+        <w:t xml:space="preserve">Originality/value — The inverted-U in this zero-inflated setting reflects a participation-barrier effect rather than intensity saturation; pooled Tier-1 coefficients mask progressive proxy obsolescence. The institutionally embedded turning-point cluster (39–46% FSTS) shifts the debate from 'does internationalisation help?' to 'under what institutional conditions does the threshold shift?'</w:t>
       </w:r>
     </w:p>
     <w:p>
@@ -267,8 +167,8 @@
         <w:t xml:space="preserve">Paper type: Research paper.</w:t>
       </w:r>
     </w:p>
-    <w:bookmarkEnd w:id="24"/>
-    <w:bookmarkStart w:id="25" w:name="highlights"/>
+    <w:bookmarkEnd w:id="20"/>
+    <w:bookmarkStart w:id="21" w:name="highlights"/>
     <w:p>
       <w:pPr>
         <w:pStyle w:val="Heading2"/>
@@ -344,8 +244,8 @@
         <w:t xml:space="preserve"> The baseline website-presence indicator is descriptively positive in 2009 (β = 0.175), null in 2015 (β = -0.044), and positive in 2023 (β = 0.095); the negative DAI × FSTS interaction observed only in 2023 (FSTS_c × DAI_z = -0.912, p = .043) is read as Tier-1 proxy obsolescence as website ownership diffuses to near-universal levels (49.8 % in 2023 vs 42.5 % in 2009), not as evidence on dynamic digital capability moderation.</w:t>
       </w:r>
     </w:p>
-    <w:bookmarkEnd w:id="25"/>
-    <w:bookmarkStart w:id="30" w:name="Xe3d0fc0bea9a42ce7605565d0964033d7f6ee47"/>
+    <w:bookmarkEnd w:id="21"/>
+    <w:bookmarkStart w:id="26" w:name="Xe3d0fc0bea9a42ce7605565d0964033d7f6ee47"/>
     <w:p>
       <w:pPr>
         <w:pStyle w:val="Heading2"/>
@@ -354,7 +254,7 @@
         <w:t xml:space="preserve">1. Introduction</w:t>
       </w:r>
     </w:p>
-    <w:bookmarkStart w:id="26" w:name="Xe5b26b80b1cffd635bf6d81ca2944b40daaf62d"/>
+    <w:bookmarkStart w:id="22" w:name="Xe5b26b80b1cffd635bf6d81ca2944b40daaf62d"/>
     <w:p>
       <w:pPr>
         <w:pStyle w:val="Heading3"/>
@@ -645,8 +545,8 @@
         <w:t xml:space="preserve">in a transitional economy, not as a continuous saturation curve in the meta-analytic sense documented in developed-market samples. We treat this step-function structure as a headline empirical contribution rather than as an ancillary robustness probe, because it locates the productivity-relevant friction at the participation margin where institutional and capability constraints bind hardest in a transitional setting.</w:t>
       </w:r>
     </w:p>
-    <w:bookmarkEnd w:id="26"/>
-    <w:bookmarkStart w:id="27" w:name="X2961a496af63dca26d6e29b654ead2e696c6fdd"/>
+    <w:bookmarkEnd w:id="22"/>
+    <w:bookmarkStart w:id="23" w:name="X2961a496af63dca26d6e29b654ead2e696c6fdd"/>
     <w:p>
       <w:pPr>
         <w:pStyle w:val="Heading3"/>
@@ -777,8 +677,8 @@
         <w:t xml:space="preserve">Recent meta-analytic work reinforces this concern. Pisani, Garcia-Bernardo, and Heemskerk (2020, SMJ) find that the inverted-U relationship between internationalisation and performance weakens substantially — and sometimes disappears — under more rigorous identification in cross-national pooled samples, suggesting that aggregation across heterogeneous institutional contexts inflates apparent functional-form regularity. Wu, Fan, and Chen (2022, MIR) extend this argument by showing in a meta-analysis of emerging-market multinationals (EMNEs) that institutional context moderates I–P effect sizes more powerfully than firm-level capability variables. Taken together, these findings imply that within-country longitudinal designs — which hold institutional context constant while varying time — provide a more credible test of whether the inverted-U is an artefact of cross-national pooling or a genuine relationship that persists as the institutional environment evolves. Vietnam's three-wave WBES panel (2009, 2015, 2023) provides exactly this design. Vietnam's macroeconomic and trade profile at the close of the observation window corroborates the transitional setting: GDP growth reached 7.09% in 2024, FDI inflows were US$20.17 billion (4.23% of GDP), and the export structure shifted substantially toward machinery and electronics — at 45.8% of total trade value, displacing the historically dominant textiles cluster — reflecting a structural upgrade in production capability that proceeded in parallel with the three survey waves (World Bank, 2025c).</w:t>
       </w:r>
     </w:p>
-    <w:bookmarkEnd w:id="27"/>
-    <w:bookmarkStart w:id="28" w:name="X494b14dde48fd709c427dcfac91526fdde5ec7e"/>
+    <w:bookmarkEnd w:id="23"/>
+    <w:bookmarkStart w:id="24" w:name="X494b14dde48fd709c427dcfac91526fdde5ec7e"/>
     <w:p>
       <w:pPr>
         <w:pStyle w:val="Heading3"/>
@@ -899,516 +799,516 @@
         <w:t xml:space="preserve">rather than as a continuous coordination-cost saturation curve. The decomposition is sharp: re-fitted on the exporter-only sub-sample, the quadratic FSTS term collapses to a non-significant β = -0.200 (p = .660), and only ~1.0 % of pooled firms occupy the ±5 percentage-point neighbourhood of the turning point. This locates the productivity-relevant friction at the participation margin — where institutional, capability, and sunk-cost barriers bind hardest in a transitional economy — rather than within the intensity tail where conventional Uppsala-style coordination-cost arguments operate. The within-exporter flatness is consistent with the view that, once a Vietnamese firm has absorbed the fixed costs of crossing into international markets, additional intensity does not by itself trigger a coordination-cost saturation strong enough to reverse the productivity gain. This step-function reading qualifies the conventional inverted-U interpretation and points toward participation-margin frictions, rather than intensity-margin saturation, as the dominant binding mechanism in transitional-economy I–P dynamics. The divergence between this pattern and those documented in digitally advanced economies, where the coordination-cost mechanism is attenuated by comprehensive digital infrastructure, anchors the digitally transitional end of the institutional spectrum and motivates institution-level mechanisms as candidate moderators of I–P curve location.</w:t>
       </w:r>
     </w:p>
+    <w:bookmarkEnd w:id="24"/>
+    <w:bookmarkStart w:id="25" w:name="Xdd618d9602139b0eee88c4277e195c55d104c48"/>
+    <w:p>
+      <w:pPr>
+        <w:pStyle w:val="Heading3"/>
+      </w:pPr>
+      <w:r>
+        <w:t xml:space="preserve">1.4 Roadmap</w:t>
+      </w:r>
+    </w:p>
+    <w:p>
+      <w:pPr>
+        <w:pStyle w:val="FirstParagraph"/>
+      </w:pPr>
+      <w:r>
+        <w:t xml:space="preserve">The remainder of the paper is organised as follows. Section 2 develops the theoretical framework</w:t>
+      </w:r>
+      <w:r>
+        <w:t xml:space="preserve"> </w:t>
+      </w:r>
+      <w:r>
+        <w:t xml:space="preserve">and hypotheses.</w:t>
+      </w:r>
+    </w:p>
+    <w:p>
+      <w:pPr>
+        <w:pStyle w:val="BodyText"/>
+      </w:pPr>
+      <w:r>
+        <w:t xml:space="preserve">Section 3 describes the data, variables, and empirical strategy.</w:t>
+      </w:r>
+    </w:p>
+    <w:p>
+      <w:pPr>
+        <w:pStyle w:val="BodyText"/>
+      </w:pPr>
+      <w:r>
+        <w:t xml:space="preserve">Section 4</w:t>
+      </w:r>
+    </w:p>
+    <w:p>
+      <w:pPr>
+        <w:pStyle w:val="BodyText"/>
+      </w:pPr>
+      <w:r>
+        <w:t xml:space="preserve">presents the results. Section 5 discusses the theoretical and managerial implications. Section 6</w:t>
+      </w:r>
+      <w:r>
+        <w:t xml:space="preserve"> </w:t>
+      </w:r>
+      <w:r>
+        <w:t xml:space="preserve">concludes.</w:t>
+      </w:r>
+    </w:p>
+    <w:bookmarkEnd w:id="25"/>
+    <w:bookmarkEnd w:id="26"/>
+    <w:bookmarkStart w:id="34" w:name="X8bf20a63f0decf7b16e99d564b9958ec4fbbb23"/>
+    <w:p>
+      <w:pPr>
+        <w:pStyle w:val="Heading2"/>
+      </w:pPr>
+      <w:r>
+        <w:t xml:space="preserve">2. Theory and hypotheses</w:t>
+      </w:r>
+    </w:p>
+    <w:bookmarkStart w:id="27" w:name="X475e56b016e644d98a8e16bb390e9ef0dd93722"/>
+    <w:p>
+      <w:pPr>
+        <w:pStyle w:val="Heading3"/>
+      </w:pPr>
+      <w:r>
+        <w:t xml:space="preserve">2.1 Internationalisation and firm performance</w:t>
+      </w:r>
+    </w:p>
+    <w:p>
+      <w:pPr>
+        <w:pStyle w:val="FirstParagraph"/>
+      </w:pPr>
+      <w:r>
+        <w:t xml:space="preserve">The relationship between internationalisation and firm performance is unlikely to be linear in</w:t>
+      </w:r>
+      <w:r>
+        <w:t xml:space="preserve"> </w:t>
+      </w:r>
+      <w:r>
+        <w:t xml:space="preserve">a transitional economy such as Vietnam. Foreign expansion can improve performance through</w:t>
+      </w:r>
+      <w:r>
+        <w:t xml:space="preserve"> </w:t>
+      </w:r>
+      <w:r>
+        <w:t xml:space="preserve">greater market reach, diversification, and learning from external environments. Firms may use</w:t>
+      </w:r>
+      <w:r>
+        <w:t xml:space="preserve"> </w:t>
+      </w:r>
+      <w:r>
+        <w:t xml:space="preserve">internationalisation to spread fixed costs, access new customers, and acquire knowledge that</w:t>
+      </w:r>
+      <w:r>
+        <w:t xml:space="preserve"> </w:t>
+      </w:r>
+      <w:r>
+        <w:t xml:space="preserve">supports operational improvement.</w:t>
+      </w:r>
+      <w:r>
+        <w:t xml:space="preserve"> </w:t>
+      </w:r>
+      <w:r>
+        <w:t xml:space="preserve">At the same time, deeper international involvement often generates coordination costs and</w:t>
+      </w:r>
+      <w:r>
+        <w:t xml:space="preserve"> </w:t>
+      </w:r>
+      <w:r>
+        <w:t xml:space="preserve">organisational burdens. Firms must manage multiple markets, reconcile diverse customer demands, process more information, and sustain greater managerial control. As foreign expansion</w:t>
+      </w:r>
+      <w:r>
+        <w:t xml:space="preserve"> </w:t>
+      </w:r>
+      <w:r>
+        <w:t xml:space="preserve">intensifies, these costs may grow faster than the benefits, producing diminishing returns or</w:t>
+      </w:r>
+      <w:r>
+        <w:t xml:space="preserve"> </w:t>
+      </w:r>
+      <w:r>
+        <w:t xml:space="preserve">even a decline in performance. This basic logic underpins the classic nonlinear view of the I–P</w:t>
+      </w:r>
+      <w:r>
+        <w:t xml:space="preserve"> </w:t>
+      </w:r>
+      <w:r>
+        <w:t xml:space="preserve">relationship (Contractor, 2007; Hennart, 2011; Marano et al., 2016). Process accounts of internationalisation, including the updated Uppsala framework, similarly emphasise that performance</w:t>
+      </w:r>
+      <w:r>
+        <w:t xml:space="preserve"> </w:t>
+      </w:r>
+      <w:r>
+        <w:t xml:space="preserve">gains and adjustment costs unfold incrementally as firms accumulate market knowledge and</w:t>
+      </w:r>
+      <w:r>
+        <w:t xml:space="preserve"> </w:t>
+      </w:r>
+      <w:r>
+        <w:t xml:space="preserve">commitment (Vahlne and Johanson, 2017; Knight and Liesch, 2016).</w:t>
+      </w:r>
+      <w:r>
+        <w:t xml:space="preserve"> </w:t>
+      </w:r>
+      <w:r>
+        <w:t xml:space="preserve">This argument is especially plausible in Vietnam because firms operate under uneven capability conditions. Some firms may convert foreign expansion into learning and scale advantages,</w:t>
+      </w:r>
+      <w:r>
+        <w:t xml:space="preserve"> </w:t>
+      </w:r>
+      <w:r>
+        <w:t xml:space="preserve">whereas others may encounter organisational strain sooner. The relevant expectation is therefore</w:t>
+      </w:r>
+      <w:r>
+        <w:t xml:space="preserve"> </w:t>
+      </w:r>
+      <w:r>
+        <w:t xml:space="preserve">not a uniformly positive slope, but a nonlinear relationship in which gains from internationalisation become progressively more difficult to sustain.</w:t>
+      </w:r>
+      <w:r>
+        <w:t xml:space="preserve"> </w:t>
+      </w:r>
+      <w:r>
+        <w:t xml:space="preserve">Two opposing forces underpin the curvature.</w:t>
+      </w:r>
+    </w:p>
+    <w:p>
+      <w:pPr>
+        <w:pStyle w:val="BodyText"/>
+      </w:pPr>
+      <w:r>
+        <w:t xml:space="preserve">On the upside, increasing direct-export in-</w:t>
+      </w:r>
+    </w:p>
+    <w:p>
+      <w:pPr>
+        <w:pStyle w:val="BodyText"/>
+      </w:pPr>
+      <w:r>
+        <w:t xml:space="preserve">tensity creates scale economies, knowledge spillovers from foreign customers, and learning-byexporting effects that lift productivity (Wagner, 2007).</w:t>
+      </w:r>
+    </w:p>
+    <w:p>
+      <w:pPr>
+        <w:pStyle w:val="BodyText"/>
+      </w:pPr>
+      <w:r>
+        <w:t xml:space="preserve">On the downside, coordinating pro-</w:t>
+      </w:r>
+    </w:p>
+    <w:p>
+      <w:pPr>
+        <w:pStyle w:val="BodyText"/>
+      </w:pPr>
+      <w:r>
+        <w:t xml:space="preserve">duction for institutionally distant markets imposes information-processing costs that grow nonlinearly: each additional foreign market adds compliance demands, customer-relationship overhead, and supply-chain dependencies whose marginal coordination cost rises faster than the</w:t>
+      </w:r>
+    </w:p>
+    <w:p>
+      <w:pPr>
+        <w:pStyle w:val="BodyText"/>
+      </w:pPr>
+      <w:r>
+        <w:t xml:space="preserve">marginal scale benefit beyond a threshold. In a transitional setting where ports, trade-finance</w:t>
+      </w:r>
+      <w:r>
+        <w:t xml:space="preserve"> </w:t>
+      </w:r>
+      <w:r>
+        <w:t xml:space="preserve">institutions, digital marketplaces, and dispute-resolution mechanisms are still maturing, this</w:t>
+      </w:r>
+      <w:r>
+        <w:t xml:space="preserve"> </w:t>
+      </w:r>
+      <w:r>
+        <w:t xml:space="preserve">threshold may bind at a lower level of export intensity than in mature economies, sharpening</w:t>
+      </w:r>
+      <w:r>
+        <w:t xml:space="preserve"> </w:t>
+      </w:r>
+      <w:r>
+        <w:t xml:space="preserve">the curvature relative to the meta-analytic baseline (Hennart, 2007; Wagner, 2007; Marano et al.,</w:t>
+      </w:r>
+      <w:r>
+        <w:t xml:space="preserve"> </w:t>
+      </w:r>
+      <w:r>
+        <w:t xml:space="preserve">2016). The mechanism is institutional transaction costs (Williamson, 1985; Hennart, 2007): in a transitional economy, enforcement gaps, logistics deficits, and information asymmetries raise the marginal cost of managing each additional foreign market, causing the post-threshold decline to bind at lower export intensity than in settings where digital infrastructure and contract-enforcement quality have already absorbed much of this friction.</w:t>
+      </w:r>
+      <w:r>
+        <w:t xml:space="preserve"> </w:t>
+      </w:r>
+      <w:r>
+        <w:t xml:space="preserve">A second consideration arises from the structure of direct-export intensity in WBES Vietnam: the FSTS variable is bounded at zero and is heavily zero-inflated (the non-exporter share</w:t>
+      </w:r>
+      <w:r>
+        <w:t xml:space="preserve"> </w:t>
+      </w:r>
+      <w:r>
+        <w:t xml:space="preserve">is 71.6 % in 2009, 79.3 % in 2015 and 81.2 % in 2023; pooled 77.4 %). The internationalisation–</w:t>
+      </w:r>
+      <w:r>
+        <w:t xml:space="preserve"> </w:t>
+      </w:r>
+      <w:r>
+        <w:t xml:space="preserve">performance relationship therefore comprises two analytically distinct margins. The participation margin is the step from FSTS = 0 to FSTS &gt; 0, where firms cross the entry threshold into</w:t>
+      </w:r>
+      <w:r>
+        <w:t xml:space="preserve"> </w:t>
+      </w:r>
+      <w:r>
+        <w:t xml:space="preserve">international markets and absorb fixed entry costs. The intensity margin is the variation of FSTS</w:t>
+      </w:r>
+      <w:r>
+        <w:t xml:space="preserve"> </w:t>
+      </w:r>
+      <w:r>
+        <w:t xml:space="preserve">within the exporter subsample.</w:t>
+      </w:r>
+    </w:p>
+    <w:p>
+      <w:pPr>
+        <w:pStyle w:val="BodyText"/>
+      </w:pPr>
+      <w:r>
+        <w:t xml:space="preserve">Theory predicts that productivity gains can accrue at either</w:t>
+      </w:r>
+    </w:p>
+    <w:p>
+      <w:pPr>
+        <w:pStyle w:val="BodyText"/>
+      </w:pPr>
+      <w:r>
+        <w:t xml:space="preserve">margin: the participation margin captures learning-by-exporting and exposure to foreign-market</w:t>
+      </w:r>
+      <w:r>
+        <w:t xml:space="preserve"> </w:t>
+      </w:r>
+      <w:r>
+        <w:t xml:space="preserve">demand; the intensity margin captures scale economies on the upside and coordination burdens</w:t>
+      </w:r>
+      <w:r>
+        <w:t xml:space="preserve"> </w:t>
+      </w:r>
+      <w:r>
+        <w:t xml:space="preserve">on the downside (Bernard et al., 2007; Wagner, 2007). In transitional economies with thin export infrastructure, the participation margin is plausibly the dominant productivity-enhancing</w:t>
+      </w:r>
+      <w:r>
+        <w:t xml:space="preserve"> </w:t>
+      </w:r>
+      <w:r>
+        <w:t xml:space="preserve">margin, while the intensity margin may show diminishing or null returns once participation has</w:t>
+      </w:r>
+      <w:r>
+        <w:t xml:space="preserve"> </w:t>
+      </w:r>
+      <w:r>
+        <w:t xml:space="preserve">been crossed.</w:t>
+      </w:r>
+    </w:p>
+    <w:p>
+      <w:pPr>
+        <w:pStyle w:val="BodyText"/>
+      </w:pPr>
+      <w:r>
+        <w:t xml:space="preserve">H1. In Vietnam's zero-inflated export setting, when firms cross the participation barrier into international markets, the internationalisation–performance relationship is non-monotonic in the full sample and is best understood through a participation-and-intensity structure, because the coordination-cost and learning mechanisms that shape I–P returns operate differently at the participation margin versus within the exporter subsample (Hennart, 2007; Wagner, 2007). (H1a, participation margin) Crossing from non-exporting (FSTS = 0) to exporting (FSTS &gt; 0) is positively associated with labour productivity, capturing the learning-and-scale jump at entry, until the intensity margin begins where scale benefits plateau and coordination costs grow. (H1b, intensity margin) Within the exporter subsample, additional direct-export intensity is expected to exhibit weaker, diminishing, or non-significant marginal returns relative to the participation margin.</w:t>
+      </w:r>
+    </w:p>
+    <w:p>
+      <w:pPr>
+        <w:pStyle w:val="BodyText"/>
+      </w:pPr>
+      <w:r>
+        <w:t xml:space="preserve">The exporter-only specification (Panel H) provides the most direct test of H1b: if the inverted-U curvature reflects within-exporter intensity variation, the quadratic term should remain significant in that sub-sample. The near-flat pattern observed in Panel H (pooled FSTS_c² β = −0.200, p = .660) instead indicates that the participation margin (H1a) is the dominant source of the full-sample curvature.</w:t>
+      </w:r>
+    </w:p>
+    <w:bookmarkEnd w:id="27"/>
+    <w:bookmarkStart w:id="28" w:name="X3d12e708079560cdc1ff0e61370aee89ebe94e7"/>
+    <w:p>
+      <w:pPr>
+        <w:pStyle w:val="Heading3"/>
+      </w:pPr>
+      <w:r>
+        <w:t xml:space="preserve">2.2 Foreign-technology and standards capability and firm performance</w:t>
+      </w:r>
+    </w:p>
+    <w:p>
+      <w:pPr>
+        <w:pStyle w:val="FirstParagraph"/>
+      </w:pPr>
+      <w:r>
+        <w:t xml:space="preserve">Following the Lall (1992) tradition for emerging-market firms, this paper uses a measurementtight reading of technological capability: a foreign-technology and standards capability that captures a firm's exposure to externally validated technological inputs — internationally recognised</w:t>
+      </w:r>
+      <w:r>
+        <w:t xml:space="preserve"> </w:t>
+      </w:r>
+      <w:r>
+        <w:t xml:space="preserve">quality certification and foreign-licensed technology. This is one observable facet of the broader</w:t>
+      </w:r>
+      <w:r>
+        <w:t xml:space="preserve"> </w:t>
+      </w:r>
+      <w:r>
+        <w:t xml:space="preserve">Cohen and Levinthal (1990) absorptive-capacity construct and the dynamic-capability construct</w:t>
+      </w:r>
+      <w:r>
+        <w:t xml:space="preserve"> </w:t>
+      </w:r>
+      <w:r>
+        <w:t xml:space="preserve">of Teece (2007), but the present measure does not claim to identify the full absorptive-capacity</w:t>
+      </w:r>
+      <w:r>
+        <w:t xml:space="preserve"> </w:t>
+      </w:r>
+      <w:r>
+        <w:t xml:space="preserve">stock; it captures the externally facing component of that stock (Eisenhardt and Martin, 2000;</w:t>
+      </w:r>
+      <w:r>
+        <w:t xml:space="preserve"> </w:t>
+      </w:r>
+      <w:r>
+        <w:t xml:space="preserve">Karna et al., 2016).</w:t>
+      </w:r>
+    </w:p>
+    <w:p>
+      <w:pPr>
+        <w:pStyle w:val="BodyText"/>
+      </w:pPr>
+      <w:r>
+        <w:t xml:space="preserve">In international settings, this externally facing capability is particularly</w:t>
+      </w:r>
+    </w:p>
+    <w:p>
+      <w:pPr>
+        <w:pStyle w:val="BodyText"/>
+      </w:pPr>
+      <w:r>
+        <w:t xml:space="preserve">important because firms must respond to unfamiliar markets, meet foreign quality standards,</w:t>
+      </w:r>
+      <w:r>
+        <w:t xml:space="preserve"> </w:t>
+      </w:r>
+      <w:r>
+        <w:t xml:space="preserve">and integrate externally licensed technology into organisational routines.</w:t>
+      </w:r>
+      <w:r>
+        <w:t xml:space="preserve"> </w:t>
+      </w:r>
+      <w:r>
+        <w:t xml:space="preserve">A firm with stronger foreign-technology / standards capability is more likely to transform</w:t>
+      </w:r>
+      <w:r>
+        <w:t xml:space="preserve"> </w:t>
+      </w:r>
+      <w:r>
+        <w:t xml:space="preserve">international exposure into productivity gains.</w:t>
+      </w:r>
+    </w:p>
+    <w:p>
+      <w:pPr>
+        <w:pStyle w:val="BodyText"/>
+      </w:pPr>
+      <w:r>
+        <w:t xml:space="preserve">It can adjust products and processes to meet</w:t>
+      </w:r>
+    </w:p>
+    <w:p>
+      <w:pPr>
+        <w:pStyle w:val="BodyText"/>
+      </w:pPr>
+      <w:r>
+        <w:t xml:space="preserve">foreign requirements more effectively, integrate licensed foreign technology into production, and</w:t>
+      </w:r>
+      <w:r>
+        <w:t xml:space="preserve"> </w:t>
+      </w:r>
+      <w:r>
+        <w:t xml:space="preserve">cope better with the operational demands created by export activity. Even when this capability</w:t>
+      </w:r>
+    </w:p>
+    <w:p>
+      <w:pPr>
+        <w:pStyle w:val="BodyText"/>
+      </w:pPr>
+      <w:r>
+        <w:t xml:space="preserve">does not fundamentally alter the curvature of the I–P relationship, it should improve the firm's</w:t>
+      </w:r>
+      <w:r>
+        <w:t xml:space="preserve"> </w:t>
+      </w:r>
+      <w:r>
+        <w:t xml:space="preserve">overall performance level by raising the productivity floor among exposed firms.</w:t>
+      </w:r>
+      <w:r>
+        <w:t xml:space="preserve"> </w:t>
+      </w:r>
+      <w:r>
+        <w:t xml:space="preserve">This implies a positive direct association between foreign-technology / standards capability</w:t>
+      </w:r>
+      <w:r>
+        <w:t xml:space="preserve"> </w:t>
+      </w:r>
+      <w:r>
+        <w:t xml:space="preserve">and firm performance in Vietnam. We treat it here as a construct that should raise the firm's</w:t>
+      </w:r>
+      <w:r>
+        <w:t xml:space="preserve"> </w:t>
+      </w:r>
+      <w:r>
+        <w:t xml:space="preserve">capacity to benefit from internationalisation and should also support productivity more broadly,</w:t>
+      </w:r>
+      <w:r>
+        <w:t xml:space="preserve"> </w:t>
+      </w:r>
+      <w:r>
+        <w:t xml:space="preserve">without assuming that it indexes the full innovation-and-R&amp;D dimension.</w:t>
+      </w:r>
+      <w:r>
+        <w:t xml:space="preserve"> </w:t>
+      </w:r>
+      <w:r>
+        <w:t xml:space="preserve">Operationally, the primary TCI_z is built from two items: internationally recognised quality</w:t>
+      </w:r>
+      <w:r>
+        <w:t xml:space="preserve"> </w:t>
+      </w:r>
+      <w:r>
+        <w:t xml:space="preserve">certification (b8) and foreign-licensed technology (e6). These items measure exposure to foreigntechnology and standards channels rather than internal R&amp;D effort or patent activity. A broader</w:t>
+      </w:r>
+      <w:r>
+        <w:t xml:space="preserve"> </w:t>
+      </w:r>
+      <w:r>
+        <w:t xml:space="preserve">innovation-augmented composite (TCI_full, adding product innovation h1 and R&amp;D activity h8)</w:t>
+      </w:r>
+      <w:r>
+        <w:t xml:space="preserve"> </w:t>
+      </w:r>
+      <w:r>
+        <w:t xml:space="preserve">is reported in 4.5 Panel A as a boundary condition: if direct effects attenuate when innovation</w:t>
+      </w:r>
+      <w:r>
+        <w:t xml:space="preserve"> </w:t>
+      </w:r>
+      <w:r>
+        <w:t xml:space="preserve">items are added, this indicates that the primary measure is informative specifically about the</w:t>
+      </w:r>
+      <w:r>
+        <w:t xml:space="preserve"> </w:t>
+      </w:r>
+      <w:r>
+        <w:t xml:space="preserve">foreign-technology / standards channel, not the broader absorptive-capacity stock.</w:t>
+      </w:r>
+    </w:p>
+    <w:p>
+      <w:pPr>
+        <w:pStyle w:val="BodyText"/>
+      </w:pPr>
+      <w:r>
+        <w:t xml:space="preserve">H2. In Vietnam's transitional export environment, when firms hold stronger foreign-technology and standards capability (TCI_z), labour productivity is higher, because exposure to internationally recognised quality certification and foreign-licensed technology raises a firm's capacity to meet foreign market requirements and integrate external technological inputs into production routines (Lall, 1992; Cohen and Levinthal, 1990), before the productivity premium from this capability channel is bounded by the firm's absorptive depth relative to the full innovation-and-R&amp;D stock (Eisenhardt and Martin, 2000).</w:t>
+      </w:r>
+    </w:p>
     <w:bookmarkEnd w:id="28"/>
-    <w:bookmarkStart w:id="29" w:name="Xdd618d9602139b0eee88c4277e195c55d104c48"/>
-    <w:p>
-      <w:pPr>
-        <w:pStyle w:val="Heading3"/>
-      </w:pPr>
-      <w:r>
-        <w:t xml:space="preserve">1.4 Roadmap</w:t>
-      </w:r>
-    </w:p>
-    <w:p>
-      <w:pPr>
-        <w:pStyle w:val="FirstParagraph"/>
-      </w:pPr>
-      <w:r>
-        <w:t xml:space="preserve">The remainder of the paper is organised as follows. Section 2 develops the theoretical framework</w:t>
-      </w:r>
-      <w:r>
-        <w:t xml:space="preserve"> </w:t>
-      </w:r>
-      <w:r>
-        <w:t xml:space="preserve">and hypotheses.</w:t>
-      </w:r>
-    </w:p>
-    <w:p>
-      <w:pPr>
-        <w:pStyle w:val="BodyText"/>
-      </w:pPr>
-      <w:r>
-        <w:t xml:space="preserve">Section 3 describes the data, variables, and empirical strategy.</w:t>
-      </w:r>
-    </w:p>
-    <w:p>
-      <w:pPr>
-        <w:pStyle w:val="BodyText"/>
-      </w:pPr>
-      <w:r>
-        <w:t xml:space="preserve">Section 4</w:t>
-      </w:r>
-    </w:p>
-    <w:p>
-      <w:pPr>
-        <w:pStyle w:val="BodyText"/>
-      </w:pPr>
-      <w:r>
-        <w:t xml:space="preserve">presents the results. Section 5 discusses the theoretical and managerial implications. Section 6</w:t>
-      </w:r>
-      <w:r>
-        <w:t xml:space="preserve"> </w:t>
-      </w:r>
-      <w:r>
-        <w:t xml:space="preserve">concludes.</w:t>
-      </w:r>
-    </w:p>
-    <w:bookmarkEnd w:id="29"/>
-    <w:bookmarkEnd w:id="30"/>
-    <w:bookmarkStart w:id="35" w:name="X8bf20a63f0decf7b16e99d564b9958ec4fbbb23"/>
-    <w:p>
-      <w:pPr>
-        <w:pStyle w:val="Heading2"/>
-      </w:pPr>
-      <w:r>
-        <w:t xml:space="preserve">2. Theory and hypotheses</w:t>
-      </w:r>
-    </w:p>
-    <w:bookmarkStart w:id="31" w:name="X475e56b016e644d98a8e16bb390e9ef0dd93722"/>
-    <w:p>
-      <w:pPr>
-        <w:pStyle w:val="Heading3"/>
-      </w:pPr>
-      <w:r>
-        <w:t xml:space="preserve">2.1 Internationalisation and firm performance</w:t>
-      </w:r>
-    </w:p>
-    <w:p>
-      <w:pPr>
-        <w:pStyle w:val="FirstParagraph"/>
-      </w:pPr>
-      <w:r>
-        <w:t xml:space="preserve">The relationship between internationalisation and firm performance is unlikely to be linear in</w:t>
-      </w:r>
-      <w:r>
-        <w:t xml:space="preserve"> </w:t>
-      </w:r>
-      <w:r>
-        <w:t xml:space="preserve">a transitional economy such as Vietnam. Foreign expansion can improve performance through</w:t>
-      </w:r>
-      <w:r>
-        <w:t xml:space="preserve"> </w:t>
-      </w:r>
-      <w:r>
-        <w:t xml:space="preserve">greater market reach, diversification, and learning from external environments. Firms may use</w:t>
-      </w:r>
-      <w:r>
-        <w:t xml:space="preserve"> </w:t>
-      </w:r>
-      <w:r>
-        <w:t xml:space="preserve">internationalisation to spread fixed costs, access new customers, and acquire knowledge that</w:t>
-      </w:r>
-      <w:r>
-        <w:t xml:space="preserve"> </w:t>
-      </w:r>
-      <w:r>
-        <w:t xml:space="preserve">supports operational improvement.</w:t>
-      </w:r>
-      <w:r>
-        <w:t xml:space="preserve"> </w:t>
-      </w:r>
-      <w:r>
-        <w:t xml:space="preserve">At the same time, deeper international involvement often generates coordination costs and</w:t>
-      </w:r>
-      <w:r>
-        <w:t xml:space="preserve"> </w:t>
-      </w:r>
-      <w:r>
-        <w:t xml:space="preserve">organisational burdens. Firms must manage multiple markets, reconcile diverse customer demands, process more information, and sustain greater managerial control. As foreign expansion</w:t>
-      </w:r>
-      <w:r>
-        <w:t xml:space="preserve"> </w:t>
-      </w:r>
-      <w:r>
-        <w:t xml:space="preserve">intensifies, these costs may grow faster than the benefits, producing diminishing returns or</w:t>
-      </w:r>
-      <w:r>
-        <w:t xml:space="preserve"> </w:t>
-      </w:r>
-      <w:r>
-        <w:t xml:space="preserve">even a decline in performance. This basic logic underpins the classic nonlinear view of the I–P</w:t>
-      </w:r>
-      <w:r>
-        <w:t xml:space="preserve"> </w:t>
-      </w:r>
-      <w:r>
-        <w:t xml:space="preserve">relationship (Contractor, 2007; Hennart, 2011; Marano et al., 2016). Process accounts of internationalisation, including the updated Uppsala framework, similarly emphasise that performance</w:t>
-      </w:r>
-      <w:r>
-        <w:t xml:space="preserve"> </w:t>
-      </w:r>
-      <w:r>
-        <w:t xml:space="preserve">gains and adjustment costs unfold incrementally as firms accumulate market knowledge and</w:t>
-      </w:r>
-      <w:r>
-        <w:t xml:space="preserve"> </w:t>
-      </w:r>
-      <w:r>
-        <w:t xml:space="preserve">commitment (Vahlne and Johanson, 2017; Knight and Liesch, 2016).</w:t>
-      </w:r>
-      <w:r>
-        <w:t xml:space="preserve"> </w:t>
-      </w:r>
-      <w:r>
-        <w:t xml:space="preserve">This argument is especially plausible in Vietnam because firms operate under uneven capability conditions. Some firms may convert foreign expansion into learning and scale advantages,</w:t>
-      </w:r>
-      <w:r>
-        <w:t xml:space="preserve"> </w:t>
-      </w:r>
-      <w:r>
-        <w:t xml:space="preserve">whereas others may encounter organisational strain sooner. The relevant expectation is therefore</w:t>
-      </w:r>
-      <w:r>
-        <w:t xml:space="preserve"> </w:t>
-      </w:r>
-      <w:r>
-        <w:t xml:space="preserve">not a uniformly positive slope, but a nonlinear relationship in which gains from internationalisation become progressively more difficult to sustain.</w:t>
-      </w:r>
-      <w:r>
-        <w:t xml:space="preserve"> </w:t>
-      </w:r>
-      <w:r>
-        <w:t xml:space="preserve">Two opposing forces underpin the curvature.</w:t>
-      </w:r>
-    </w:p>
-    <w:p>
-      <w:pPr>
-        <w:pStyle w:val="BodyText"/>
-      </w:pPr>
-      <w:r>
-        <w:t xml:space="preserve">On the upside, increasing direct-export in-</w:t>
-      </w:r>
-    </w:p>
-    <w:p>
-      <w:pPr>
-        <w:pStyle w:val="BodyText"/>
-      </w:pPr>
-      <w:r>
-        <w:t xml:space="preserve">tensity creates scale economies, knowledge spillovers from foreign customers, and learning-byexporting effects that lift productivity (Wagner, 2007).</w:t>
-      </w:r>
-    </w:p>
-    <w:p>
-      <w:pPr>
-        <w:pStyle w:val="BodyText"/>
-      </w:pPr>
-      <w:r>
-        <w:t xml:space="preserve">On the downside, coordinating pro-</w:t>
-      </w:r>
-    </w:p>
-    <w:p>
-      <w:pPr>
-        <w:pStyle w:val="BodyText"/>
-      </w:pPr>
-      <w:r>
-        <w:t xml:space="preserve">duction for institutionally distant markets imposes information-processing costs that grow nonlinearly: each additional foreign market adds compliance demands, customer-relationship overhead, and supply-chain dependencies whose marginal coordination cost rises faster than the</w:t>
-      </w:r>
-    </w:p>
-    <w:p>
-      <w:pPr>
-        <w:pStyle w:val="BodyText"/>
-      </w:pPr>
-      <w:r>
-        <w:t xml:space="preserve">marginal scale benefit beyond a threshold. In a transitional setting where ports, trade-finance</w:t>
-      </w:r>
-      <w:r>
-        <w:t xml:space="preserve"> </w:t>
-      </w:r>
-      <w:r>
-        <w:t xml:space="preserve">institutions, digital marketplaces, and dispute-resolution mechanisms are still maturing, this</w:t>
-      </w:r>
-      <w:r>
-        <w:t xml:space="preserve"> </w:t>
-      </w:r>
-      <w:r>
-        <w:t xml:space="preserve">threshold may bind at a lower level of export intensity than in mature economies, sharpening</w:t>
-      </w:r>
-      <w:r>
-        <w:t xml:space="preserve"> </w:t>
-      </w:r>
-      <w:r>
-        <w:t xml:space="preserve">the curvature relative to the meta-analytic baseline (Hennart, 2007; Wagner, 2007; Marano et al.,</w:t>
-      </w:r>
-      <w:r>
-        <w:t xml:space="preserve"> </w:t>
-      </w:r>
-      <w:r>
-        <w:t xml:space="preserve">2016). The mechanism is institutional transaction costs (Williamson, 1985; Hennart, 2007): in a transitional economy, enforcement gaps, logistics deficits, and information asymmetries raise the marginal cost of managing each additional foreign market, causing the post-threshold decline to bind at lower export intensity than in settings where digital infrastructure and contract-enforcement quality have already absorbed much of this friction.</w:t>
-      </w:r>
-      <w:r>
-        <w:t xml:space="preserve"> </w:t>
-      </w:r>
-      <w:r>
-        <w:t xml:space="preserve">A second consideration arises from the structure of direct-export intensity in WBES Vietnam: the FSTS variable is bounded at zero and is heavily zero-inflated (the non-exporter share</w:t>
-      </w:r>
-      <w:r>
-        <w:t xml:space="preserve"> </w:t>
-      </w:r>
-      <w:r>
-        <w:t xml:space="preserve">is 71.6 % in 2009, 79.3 % in 2015 and 81.2 % in 2023; pooled 77.4 %). The internationalisation–</w:t>
-      </w:r>
-      <w:r>
-        <w:t xml:space="preserve"> </w:t>
-      </w:r>
-      <w:r>
-        <w:t xml:space="preserve">performance relationship therefore comprises two analytically distinct margins. The participation margin is the step from FSTS = 0 to FSTS &gt; 0, where firms cross the entry threshold into</w:t>
-      </w:r>
-      <w:r>
-        <w:t xml:space="preserve"> </w:t>
-      </w:r>
-      <w:r>
-        <w:t xml:space="preserve">international markets and absorb fixed entry costs. The intensity margin is the variation of FSTS</w:t>
-      </w:r>
-      <w:r>
-        <w:t xml:space="preserve"> </w:t>
-      </w:r>
-      <w:r>
-        <w:t xml:space="preserve">within the exporter subsample.</w:t>
-      </w:r>
-    </w:p>
-    <w:p>
-      <w:pPr>
-        <w:pStyle w:val="BodyText"/>
-      </w:pPr>
-      <w:r>
-        <w:t xml:space="preserve">Theory predicts that productivity gains can accrue at either</w:t>
-      </w:r>
-    </w:p>
-    <w:p>
-      <w:pPr>
-        <w:pStyle w:val="BodyText"/>
-      </w:pPr>
-      <w:r>
-        <w:t xml:space="preserve">margin: the participation margin captures learning-by-exporting and exposure to foreign-market</w:t>
-      </w:r>
-      <w:r>
-        <w:t xml:space="preserve"> </w:t>
-      </w:r>
-      <w:r>
-        <w:t xml:space="preserve">demand; the intensity margin captures scale economies on the upside and coordination burdens</w:t>
-      </w:r>
-      <w:r>
-        <w:t xml:space="preserve"> </w:t>
-      </w:r>
-      <w:r>
-        <w:t xml:space="preserve">on the downside (Bernard et al., 2007; Wagner, 2007). In transitional economies with thin export infrastructure, the participation margin is plausibly the dominant productivity-enhancing</w:t>
-      </w:r>
-      <w:r>
-        <w:t xml:space="preserve"> </w:t>
-      </w:r>
-      <w:r>
-        <w:t xml:space="preserve">margin, while the intensity margin may show diminishing or null returns once participation has</w:t>
-      </w:r>
-      <w:r>
-        <w:t xml:space="preserve"> </w:t>
-      </w:r>
-      <w:r>
-        <w:t xml:space="preserve">been crossed.</w:t>
-      </w:r>
-    </w:p>
-    <w:p>
-      <w:pPr>
-        <w:pStyle w:val="BodyText"/>
-      </w:pPr>
-      <w:r>
-        <w:t xml:space="preserve">H1. In Vietnam's zero-inflated export setting, when firms cross the participation barrier into international markets, the internationalisation–performance relationship is non-monotonic in the full sample and is best understood through a participation-and-intensity structure, because the coordination-cost and learning mechanisms that shape I–P returns operate differently at the participation margin versus within the exporter subsample (Hennart, 2007; Wagner, 2007). (H1a, participation margin) Crossing from non-exporting (FSTS = 0) to exporting (FSTS &gt; 0) is positively associated with labour productivity, capturing the learning-and-scale jump at entry, until the intensity margin begins where scale benefits plateau and coordination costs grow. (H1b, intensity margin) Within the exporter subsample, additional direct-export intensity is expected to exhibit weaker, diminishing, or non-significant marginal returns relative to the participation margin.</w:t>
-      </w:r>
-    </w:p>
-    <w:p>
-      <w:pPr>
-        <w:pStyle w:val="BodyText"/>
-      </w:pPr>
-      <w:r>
-        <w:t xml:space="preserve">The exporter-only specification (Panel H) provides the most direct test of H1b: if the inverted-U curvature reflects within-exporter intensity variation, the quadratic term should remain significant in that sub-sample. The near-flat pattern observed in Panel H (pooled FSTS_c² β = −0.200, p = .660) instead indicates that the participation margin (H1a) is the dominant source of the full-sample curvature.</w:t>
-      </w:r>
-    </w:p>
-    <w:bookmarkEnd w:id="31"/>
-    <w:bookmarkStart w:id="32" w:name="X3d12e708079560cdc1ff0e61370aee89ebe94e7"/>
-    <w:p>
-      <w:pPr>
-        <w:pStyle w:val="Heading3"/>
-      </w:pPr>
-      <w:r>
-        <w:t xml:space="preserve">2.2 Foreign-technology and standards capability and firm performance</w:t>
-      </w:r>
-    </w:p>
-    <w:p>
-      <w:pPr>
-        <w:pStyle w:val="FirstParagraph"/>
-      </w:pPr>
-      <w:r>
-        <w:t xml:space="preserve">Following the Lall (1992) tradition for emerging-market firms, this paper uses a measurementtight reading of technological capability: a foreign-technology and standards capability that captures a firm's exposure to externally validated technological inputs — internationally recognised</w:t>
-      </w:r>
-      <w:r>
-        <w:t xml:space="preserve"> </w:t>
-      </w:r>
-      <w:r>
-        <w:t xml:space="preserve">quality certification and foreign-licensed technology. This is one observable facet of the broader</w:t>
-      </w:r>
-      <w:r>
-        <w:t xml:space="preserve"> </w:t>
-      </w:r>
-      <w:r>
-        <w:t xml:space="preserve">Cohen and Levinthal (1990) absorptive-capacity construct and the dynamic-capability construct</w:t>
-      </w:r>
-      <w:r>
-        <w:t xml:space="preserve"> </w:t>
-      </w:r>
-      <w:r>
-        <w:t xml:space="preserve">of Teece (2007), but the present measure does not claim to identify the full absorptive-capacity</w:t>
-      </w:r>
-      <w:r>
-        <w:t xml:space="preserve"> </w:t>
-      </w:r>
-      <w:r>
-        <w:t xml:space="preserve">stock; it captures the externally facing component of that stock (Eisenhardt and Martin, 2000;</w:t>
-      </w:r>
-      <w:r>
-        <w:t xml:space="preserve"> </w:t>
-      </w:r>
-      <w:r>
-        <w:t xml:space="preserve">Karna et al., 2016).</w:t>
-      </w:r>
-    </w:p>
-    <w:p>
-      <w:pPr>
-        <w:pStyle w:val="BodyText"/>
-      </w:pPr>
-      <w:r>
-        <w:t xml:space="preserve">In international settings, this externally facing capability is particularly</w:t>
-      </w:r>
-    </w:p>
-    <w:p>
-      <w:pPr>
-        <w:pStyle w:val="BodyText"/>
-      </w:pPr>
-      <w:r>
-        <w:t xml:space="preserve">important because firms must respond to unfamiliar markets, meet foreign quality standards,</w:t>
-      </w:r>
-      <w:r>
-        <w:t xml:space="preserve"> </w:t>
-      </w:r>
-      <w:r>
-        <w:t xml:space="preserve">and integrate externally licensed technology into organisational routines.</w:t>
-      </w:r>
-      <w:r>
-        <w:t xml:space="preserve"> </w:t>
-      </w:r>
-      <w:r>
-        <w:t xml:space="preserve">A firm with stronger foreign-technology / standards capability is more likely to transform</w:t>
-      </w:r>
-      <w:r>
-        <w:t xml:space="preserve"> </w:t>
-      </w:r>
-      <w:r>
-        <w:t xml:space="preserve">international exposure into productivity gains.</w:t>
-      </w:r>
-    </w:p>
-    <w:p>
-      <w:pPr>
-        <w:pStyle w:val="BodyText"/>
-      </w:pPr>
-      <w:r>
-        <w:t xml:space="preserve">It can adjust products and processes to meet</w:t>
-      </w:r>
-    </w:p>
-    <w:p>
-      <w:pPr>
-        <w:pStyle w:val="BodyText"/>
-      </w:pPr>
-      <w:r>
-        <w:t xml:space="preserve">foreign requirements more effectively, integrate licensed foreign technology into production, and</w:t>
-      </w:r>
-      <w:r>
-        <w:t xml:space="preserve"> </w:t>
-      </w:r>
-      <w:r>
-        <w:t xml:space="preserve">cope better with the operational demands created by export activity. Even when this capability</w:t>
-      </w:r>
-    </w:p>
-    <w:p>
-      <w:pPr>
-        <w:pStyle w:val="BodyText"/>
-      </w:pPr>
-      <w:r>
-        <w:t xml:space="preserve">does not fundamentally alter the curvature of the I–P relationship, it should improve the firm's</w:t>
-      </w:r>
-      <w:r>
-        <w:t xml:space="preserve"> </w:t>
-      </w:r>
-      <w:r>
-        <w:t xml:space="preserve">overall performance level by raising the productivity floor among exposed firms.</w:t>
-      </w:r>
-      <w:r>
-        <w:t xml:space="preserve"> </w:t>
-      </w:r>
-      <w:r>
-        <w:t xml:space="preserve">This implies a positive direct association between foreign-technology / standards capability</w:t>
-      </w:r>
-      <w:r>
-        <w:t xml:space="preserve"> </w:t>
-      </w:r>
-      <w:r>
-        <w:t xml:space="preserve">and firm performance in Vietnam. We treat it here as a construct that should raise the firm's</w:t>
-      </w:r>
-      <w:r>
-        <w:t xml:space="preserve"> </w:t>
-      </w:r>
-      <w:r>
-        <w:t xml:space="preserve">capacity to benefit from internationalisation and should also support productivity more broadly,</w:t>
-      </w:r>
-      <w:r>
-        <w:t xml:space="preserve"> </w:t>
-      </w:r>
-      <w:r>
-        <w:t xml:space="preserve">without assuming that it indexes the full innovation-and-R&amp;D dimension.</w:t>
-      </w:r>
-      <w:r>
-        <w:t xml:space="preserve"> </w:t>
-      </w:r>
-      <w:r>
-        <w:t xml:space="preserve">Operationally, the primary TCI_z is built from two items: internationally recognised quality</w:t>
-      </w:r>
-      <w:r>
-        <w:t xml:space="preserve"> </w:t>
-      </w:r>
-      <w:r>
-        <w:t xml:space="preserve">certification (b8) and foreign-licensed technology (e6). These items measure exposure to foreigntechnology and standards channels rather than internal R&amp;D effort or patent activity. A broader</w:t>
-      </w:r>
-      <w:r>
-        <w:t xml:space="preserve"> </w:t>
-      </w:r>
-      <w:r>
-        <w:t xml:space="preserve">innovation-augmented composite (TCI_full, adding product innovation h1 and R&amp;D activity h8)</w:t>
-      </w:r>
-      <w:r>
-        <w:t xml:space="preserve"> </w:t>
-      </w:r>
-      <w:r>
-        <w:t xml:space="preserve">is reported in 4.5 Panel A as a boundary condition: if direct effects attenuate when innovation</w:t>
-      </w:r>
-      <w:r>
-        <w:t xml:space="preserve"> </w:t>
-      </w:r>
-      <w:r>
-        <w:t xml:space="preserve">items are added, this indicates that the primary measure is informative specifically about the</w:t>
-      </w:r>
-      <w:r>
-        <w:t xml:space="preserve"> </w:t>
-      </w:r>
-      <w:r>
-        <w:t xml:space="preserve">foreign-technology / standards channel, not the broader absorptive-capacity stock.</w:t>
-      </w:r>
-    </w:p>
-    <w:p>
-      <w:pPr>
-        <w:pStyle w:val="BodyText"/>
-      </w:pPr>
-      <w:r>
-        <w:t xml:space="preserve">H2. In Vietnam's transitional export environment, when firms hold stronger foreign-technology and standards capability (TCI_z), labour productivity is higher, because exposure to internationally recognised quality certification and foreign-licensed technology raises a firm's capacity to meet foreign market requirements and integrate external technological inputs into production routines (Lall, 1992; Cohen and Levinthal, 1990), before the productivity premium from this capability channel is bounded by the firm's absorptive depth relative to the full innovation-and-R&amp;D stock (Eisenhardt and Martin, 2000).</w:t>
-      </w:r>
-    </w:p>
-    <w:bookmarkEnd w:id="32"/>
-    <w:bookmarkStart w:id="33" w:name="X02827d6cc0af65ac39b2d56f2f17672268c2f6b"/>
+    <w:bookmarkStart w:id="29" w:name="X02827d6cc0af65ac39b2d56f2f17672268c2f6b"/>
     <w:p>
       <w:pPr>
         <w:pStyle w:val="Heading3"/>
@@ -1610,6 +1510,24 @@
           <w:bCs/>
           <w:b/>
         </w:rPr>
+        <w:t xml:space="preserve">Note on hypothesis numbering.</w:t>
+      </w:r>
+      <w:r>
+        <w:t xml:space="preserve"> </w:t>
+      </w:r>
+      <w:r>
+        <w:t xml:space="preserve">Because DAI_z is not advanced as a primary hypothesis in this study, no H3 is formulated in the present paper. The exploratory digital moderation probe that follows (§2.4) is designated H4 to preserve alignment with the broader dissertation framework, in which H3 conventionally corresponds to institutional moderation in multi-country papers (P5 China, P7 Multi-country). Readers expecting H1–H2–H3–H4 sequencing should note this deliberate gap and the rationale above.</w:t>
+      </w:r>
+    </w:p>
+    <w:p>
+      <w:pPr>
+        <w:pStyle w:val="BodyText"/>
+      </w:pPr>
+      <w:r>
+        <w:rPr>
+          <w:bCs/>
+          <w:b/>
+        </w:rPr>
         <w:t xml:space="preserve">WBES-scope caveat.</w:t>
       </w:r>
       <w:r>
@@ -1619,8 +1537,8 @@
         <w:t xml:space="preserve">Because the WBES Vietnam instrument carries only the website-presence binary (c22b) comparably across the 2009 / 2015 / 2023 waves, this paper does not attempt to test higher-tier digital-transformation mechanisms such as data-driven decision-making, AI integration, or ERP-based process digitisation. Any descriptive coefficient on DAI_z should be read as reflecting baseline digital-presence variation, not dynamic digital capability. This caveat shields the present analysis from over-claiming on the limited Tier-1 information that a single binary website indicator can provide.</w:t>
       </w:r>
     </w:p>
-    <w:bookmarkEnd w:id="33"/>
-    <w:bookmarkStart w:id="34" w:name="Xa301591a4bdc42129e76c2a2b73514232150381"/>
+    <w:bookmarkEnd w:id="29"/>
+    <w:bookmarkStart w:id="33" w:name="Xa301591a4bdc42129e76c2a2b73514232150381"/>
     <w:p>
       <w:pPr>
         <w:pStyle w:val="Heading3"/>
@@ -1964,7 +1882,46 @@
         <w:pStyle w:val="BodyText"/>
       </w:pPr>
       <w:r>
-        <w:t xml:space="preserve">Figure 1: Conceptual model — TCI, DAI, and export intensity as determinants of firm performance (Vietnam, 3-wave)</w:t>
+        <w:drawing>
+          <wp:inline>
+            <wp:extent cx="5753100" cy="3160501"/>
+            <wp:effectExtent b="0" l="0" r="0" t="0"/>
+            <wp:docPr descr="Figure 1: Conceptual model — TCI, DAI, and export intensity as determinants of firm performance (Vietnam, 3-wave)" title="" id="31" name="Picture"/>
+            <a:graphic>
+              <a:graphicData uri="http://schemas.openxmlformats.org/drawingml/2006/picture">
+                <pic:pic>
+                  <pic:nvPicPr>
+                    <pic:cNvPr descr="figures/vietnam/figure_1_conceptual_model.png" id="32" name="Picture"/>
+                    <pic:cNvPicPr>
+                      <a:picLocks noChangeArrowheads="1" noChangeAspect="1"/>
+                    </pic:cNvPicPr>
+                  </pic:nvPicPr>
+                  <pic:blipFill>
+                    <a:blip r:embed="rId30"/>
+                    <a:stretch>
+                      <a:fillRect/>
+                    </a:stretch>
+                  </pic:blipFill>
+                  <pic:spPr bwMode="auto">
+                    <a:xfrm>
+                      <a:off x="0" y="0"/>
+                      <a:ext cx="5753100" cy="3160501"/>
+                    </a:xfrm>
+                    <a:prstGeom prst="rect">
+                      <a:avLst/>
+                    </a:prstGeom>
+                    <a:noFill/>
+                    <a:ln w="9525">
+                      <a:noFill/>
+                      <a:headEnd/>
+                      <a:tailEnd/>
+                    </a:ln>
+                  </pic:spPr>
+                </pic:pic>
+              </a:graphicData>
+            </a:graphic>
+          </wp:inline>
+        </w:drawing>
       </w:r>
     </w:p>
     <w:p>
@@ -2003,84 +1960,84 @@
         <w:t xml:space="preserve">Solid arrows represent hypothesised direct and curvilinear effects. Dashed arrows represent moderating effects. The independent variable — internationalisation intensity (FSTS, centred FSTS_c and FSTS_c²) — is placed at left; the dependent variable — firm performance, measured as ln(labour productivity) = ln(annual revenue PPP / permanent workers) — is placed at right, following left-to-right causal flow convention. H1 (inverted-U nonlinearity: β₁ &gt; 0, β₂ &lt; 0) is grounded in the Uppsala model (Johanson &amp; Vahlne, 1977, 2009) and coordination-cost theory (Hitt et al., 1997). H2 specifies technological capability (TCI_z, Resource-Based View: Barney, 1991) as a level-shifting direct effect and secondary moderator on the FSTS–performance curve; instrument: industry-level TCI mean (causal IV identification). H4 treats website-based digital adoption (DAI_z, Tier-1 only) as an exploratory probe of the Digital Capability Lens (Banalieva &amp; Dhanaraj, 2019); measurement constraint acknowledged — single binary indicator across 2009/2015/2023 waves limits inferential strength. (+) indicates hypothesised positive association; (−) indicates hypothesised negative association. Control variables (ln firm size, firm age, foreign ownership, broad-sector fixed effects, wave fixed effects) enter additively in all models but are omitted from the figure for clarity. ICRV context: Vietnam — Nhóm IV (Lower_mid_transition, ICRV Group 4 of 6; lower-middle-income transition economy; WGI Rule of Law ≈ −0.09 in 2023, World Bank). Data: WBES 2009, 2015, 2023; N = 2,958 (pooled), n_wave = 989/956/1,013.</w:t>
       </w:r>
     </w:p>
+    <w:bookmarkEnd w:id="33"/>
     <w:bookmarkEnd w:id="34"/>
+    <w:bookmarkStart w:id="40" w:name="Xfd2f05febb90fd7f58b14547dd9b33901f267a5"/>
+    <w:p>
+      <w:pPr>
+        <w:pStyle w:val="Heading2"/>
+      </w:pPr>
+      <w:r>
+        <w:t xml:space="preserve">3. Data, variables, and empirical strategy</w:t>
+      </w:r>
+    </w:p>
+    <w:bookmarkStart w:id="35" w:name="X690a6f2a93b97075aa335e9e4cac18d5293d91d"/>
+    <w:p>
+      <w:pPr>
+        <w:pStyle w:val="Heading3"/>
+      </w:pPr>
+      <w:r>
+        <w:t xml:space="preserve">3.1 Data structure</w:t>
+      </w:r>
+    </w:p>
+    <w:p>
+      <w:pPr>
+        <w:pStyle w:val="FirstParagraph"/>
+      </w:pPr>
+      <w:r>
+        <w:t xml:space="preserve">The empirical analysis uses harmonised firm-level evidence for Vietnam across three waves of the</w:t>
+      </w:r>
+      <w:r>
+        <w:t xml:space="preserve"> </w:t>
+      </w:r>
+      <w:r>
+        <w:t xml:space="preserve">World Bank Enterprise Survey: 2009, 2015 and 2023 (World Bank, 2010, 2016, 2024). Estimating</w:t>
+      </w:r>
+      <w:r>
+        <w:t xml:space="preserve"> </w:t>
+      </w:r>
+      <w:r>
+        <w:t xml:space="preserve">the models separately by wave makes it possible to observe whether relationships are stable or</w:t>
+      </w:r>
+      <w:r>
+        <w:t xml:space="preserve"> </w:t>
+      </w:r>
+      <w:r>
+        <w:t xml:space="preserve">time specific, while pooled estimation identifies average effects across the broader period.</w:t>
+      </w:r>
+      <w:r>
+        <w:t xml:space="preserve"> </w:t>
+      </w:r>
+      <w:r>
+        <w:t xml:space="preserve">The effective estimation sample varies across model specifications because of missing values in</w:t>
+      </w:r>
+      <w:r>
+        <w:t xml:space="preserve"> </w:t>
+      </w:r>
+      <w:r>
+        <w:t xml:space="preserve">the capability variables. In the full wave-specific models, the usable samples are 989 observations</w:t>
+      </w:r>
+      <w:r>
+        <w:t xml:space="preserve"> </w:t>
+      </w:r>
+      <w:r>
+        <w:t xml:space="preserve">for 2009, 956 for 2015, and 1,013 for 2023. The pooled full model contains 2,958 observations.</w:t>
+      </w:r>
+      <w:r>
+        <w:t xml:space="preserve"> </w:t>
+      </w:r>
+      <w:r>
+        <w:t xml:space="preserve">This structure provides sufficient variation to compare direct effects and conditional patterns</w:t>
+      </w:r>
+      <w:r>
+        <w:t xml:space="preserve"> </w:t>
+      </w:r>
+      <w:r>
+        <w:t xml:space="preserve">across stages.</w:t>
+      </w:r>
+    </w:p>
     <w:bookmarkEnd w:id="35"/>
-    <w:bookmarkStart w:id="41" w:name="Xfd2f05febb90fd7f58b14547dd9b33901f267a5"/>
-    <w:p>
-      <w:pPr>
-        <w:pStyle w:val="Heading2"/>
-      </w:pPr>
-      <w:r>
-        <w:t xml:space="preserve">3. Data, variables, and empirical strategy</w:t>
-      </w:r>
-    </w:p>
-    <w:bookmarkStart w:id="36" w:name="X690a6f2a93b97075aa335e9e4cac18d5293d91d"/>
-    <w:p>
-      <w:pPr>
-        <w:pStyle w:val="Heading3"/>
-      </w:pPr>
-      <w:r>
-        <w:t xml:space="preserve">3.1 Data structure</w:t>
-      </w:r>
-    </w:p>
-    <w:p>
-      <w:pPr>
-        <w:pStyle w:val="FirstParagraph"/>
-      </w:pPr>
-      <w:r>
-        <w:t xml:space="preserve">The empirical analysis uses harmonised firm-level evidence for Vietnam across three waves of the</w:t>
-      </w:r>
-      <w:r>
-        <w:t xml:space="preserve"> </w:t>
-      </w:r>
-      <w:r>
-        <w:t xml:space="preserve">World Bank Enterprise Survey: 2009, 2015 and 2023 (World Bank, 2010, 2016, 2024). Estimating</w:t>
-      </w:r>
-      <w:r>
-        <w:t xml:space="preserve"> </w:t>
-      </w:r>
-      <w:r>
-        <w:t xml:space="preserve">the models separately by wave makes it possible to observe whether relationships are stable or</w:t>
-      </w:r>
-      <w:r>
-        <w:t xml:space="preserve"> </w:t>
-      </w:r>
-      <w:r>
-        <w:t xml:space="preserve">time specific, while pooled estimation identifies average effects across the broader period.</w:t>
-      </w:r>
-      <w:r>
-        <w:t xml:space="preserve"> </w:t>
-      </w:r>
-      <w:r>
-        <w:t xml:space="preserve">The effective estimation sample varies across model specifications because of missing values in</w:t>
-      </w:r>
-      <w:r>
-        <w:t xml:space="preserve"> </w:t>
-      </w:r>
-      <w:r>
-        <w:t xml:space="preserve">the capability variables. In the full wave-specific models, the usable samples are 989 observations</w:t>
-      </w:r>
-      <w:r>
-        <w:t xml:space="preserve"> </w:t>
-      </w:r>
-      <w:r>
-        <w:t xml:space="preserve">for 2009, 956 for 2015, and 1,013 for 2023. The pooled full model contains 2,958 observations.</w:t>
-      </w:r>
-      <w:r>
-        <w:t xml:space="preserve"> </w:t>
-      </w:r>
-      <w:r>
-        <w:t xml:space="preserve">This structure provides sufficient variation to compare direct effects and conditional patterns</w:t>
-      </w:r>
-      <w:r>
-        <w:t xml:space="preserve"> </w:t>
-      </w:r>
-      <w:r>
-        <w:t xml:space="preserve">across stages.</w:t>
-      </w:r>
-    </w:p>
-    <w:bookmarkEnd w:id="36"/>
-    <w:bookmarkStart w:id="37" w:name="Xbcf9f12e79107fa2c089aaf13fc6c4fb773f1c2"/>
+    <w:bookmarkStart w:id="36" w:name="Xbcf9f12e79107fa2c089aaf13fc6c4fb773f1c2"/>
     <w:p>
       <w:pPr>
         <w:pStyle w:val="Heading3"/>
@@ -2972,8 +2929,8 @@
         <w:t xml:space="preserve">and 2023 respectively; pooled N is 2,958.</w:t>
       </w:r>
     </w:p>
-    <w:bookmarkEnd w:id="37"/>
-    <w:bookmarkStart w:id="38" w:name="Xc5fe1f3cf583535f12a87a680dcd317400b3da2"/>
+    <w:bookmarkEnd w:id="36"/>
+    <w:bookmarkStart w:id="37" w:name="Xc5fe1f3cf583535f12a87a680dcd317400b3da2"/>
     <w:p>
       <w:pPr>
         <w:pStyle w:val="Heading3"/>
@@ -3316,8 +3273,8 @@
         <w:t xml:space="preserve">All models are estimated by OLS with HC1 heteroscedasticity-consistent standard errors. Wave fixed effects (λ_t) are included in pooled specifications only. The M0–M8 sequence is estimated wave-by-wave and jointly on the pooled three-wave file, yielding four sets of estimates (2009, 2015, 2023, pooled).</w:t>
       </w:r>
     </w:p>
-    <w:bookmarkEnd w:id="38"/>
-    <w:bookmarkStart w:id="39" w:name="Xe803d156752d85865c6c4f44f4ca9bbe59bf0f9"/>
+    <w:bookmarkEnd w:id="37"/>
+    <w:bookmarkStart w:id="38" w:name="Xe803d156752d85865c6c4f44f4ca9bbe59bf0f9"/>
     <w:p>
       <w:pPr>
         <w:pStyle w:val="Heading3"/>
@@ -3396,14 +3353,89 @@
         <w:t xml:space="preserve">The repeated-cross-section data structure (three non-overlapping surveys of different firms) precludes within-firm fixed-effects estimation; the identification strategy therefore relies on the three complementary approaches above rather than panel differencing. All inferences are described as associations with the selection-robustness caveats noted above, consistent with the inferential conventions for cross-sectional WBES data (Antonakis et al., 2010; Shaver, 2020).</w:t>
       </w:r>
     </w:p>
+    <w:bookmarkEnd w:id="38"/>
+    <w:bookmarkStart w:id="39" w:name="X976281aae9d7cc6accc3a8a15180eec1c0b7e58"/>
+    <w:p>
+      <w:pPr>
+        <w:pStyle w:val="Heading3"/>
+      </w:pPr>
+      <w:r>
+        <w:t xml:space="preserve">3.5 Replication and reproducibility</w:t>
+      </w:r>
+    </w:p>
+    <w:p>
+      <w:pPr>
+        <w:pStyle w:val="FirstParagraph"/>
+      </w:pPr>
+      <w:r>
+        <w:t xml:space="preserve">The full pipeline is implemented as a 10-step Stata blueprint distributed with the manuscript.</w:t>
+      </w:r>
+      <w:r>
+        <w:t xml:space="preserve"> </w:t>
+      </w:r>
+      <w:r>
+        <w:t xml:space="preserve">The build steps (01–04) clean each WBES wave, harmonise the focal variable set, and append</w:t>
+      </w:r>
+      <w:r>
+        <w:t xml:space="preserve"> </w:t>
+      </w:r>
+      <w:r>
+        <w:t xml:space="preserve">the three waves into a pooled file with within-wave centring and z-standardisation reapplied.</w:t>
+      </w:r>
+      <w:r>
+        <w:t xml:space="preserve"> </w:t>
+      </w:r>
+      <w:r>
+        <w:t xml:space="preserve">Estimation steps (05–09) cover the M0–M8 nested sequence, the Lind–Mehlum turning-point</w:t>
+      </w:r>
+      <w:r>
+        <w:t xml:space="preserve"> </w:t>
+      </w:r>
+      <w:r>
+        <w:t xml:space="preserve">check, manual Heckman selection probes, Paternoster et al. (1998) cross-wave z-tests, and the</w:t>
+      </w:r>
+      <w:r>
+        <w:t xml:space="preserve"> </w:t>
+      </w:r>
+      <w:r>
+        <w:t xml:space="preserve">robustness panels described in 4.5. The export step (10) writes the manuscript-facing tables</w:t>
+      </w:r>
+      <w:r>
+        <w:t xml:space="preserve"> </w:t>
+      </w:r>
+      <w:r>
+        <w:t xml:space="preserve">and Figure 2 directly from the stored estimates.</w:t>
+      </w:r>
+    </w:p>
+    <w:p>
+      <w:pPr>
+        <w:pStyle w:val="BodyText"/>
+      </w:pPr>
+      <w:r>
+        <w:t xml:space="preserve">Rerunning the pipeline from a fresh clone reproduces every coefficient reported below; the manuscript text rather than the do-file output is</w:t>
+      </w:r>
+      <w:r>
+        <w:t xml:space="preserve"> </w:t>
+      </w:r>
+      <w:r>
+        <w:t xml:space="preserve">the object that adjusts when the rerun drifts from the prose. Throughout, we follow current bestpractice recommendations on data preparation, transparency, and the cumulative interpretation</w:t>
+      </w:r>
+      <w:r>
+        <w:t xml:space="preserve"> </w:t>
+      </w:r>
+      <w:r>
+        <w:t xml:space="preserve">of associational evidence (Aguinis et al., 2021; Shaver, 2020).</w:t>
+      </w:r>
+    </w:p>
     <w:bookmarkEnd w:id="39"/>
-    <w:bookmarkStart w:id="40" w:name="X976281aae9d7cc6accc3a8a15180eec1c0b7e58"/>
-    <w:p>
-      <w:pPr>
-        <w:pStyle w:val="Heading3"/>
-      </w:pPr>
-      <w:r>
-        <w:t xml:space="preserve">3.5 Replication and reproducibility</w:t>
+    <w:bookmarkEnd w:id="40"/>
+    <w:bookmarkStart w:id="63" w:name="X121719332867ee227f0a04b486098cee978c6e6"/>
+    <w:p>
+      <w:pPr>
+        <w:pStyle w:val="Heading2"/>
+      </w:pPr>
+      <w:r>
+        <w:t xml:space="preserve">4. Results</w:t>
       </w:r>
     </w:p>
     <w:p>
@@ -3411,81 +3443,6 @@
         <w:pStyle w:val="FirstParagraph"/>
       </w:pPr>
       <w:r>
-        <w:t xml:space="preserve">The full pipeline is implemented as a 10-step Stata blueprint distributed with the manuscript.</w:t>
-      </w:r>
-      <w:r>
-        <w:t xml:space="preserve"> </w:t>
-      </w:r>
-      <w:r>
-        <w:t xml:space="preserve">The build steps (01–04) clean each WBES wave, harmonise the focal variable set, and append</w:t>
-      </w:r>
-      <w:r>
-        <w:t xml:space="preserve"> </w:t>
-      </w:r>
-      <w:r>
-        <w:t xml:space="preserve">the three waves into a pooled file with within-wave centring and z-standardisation reapplied.</w:t>
-      </w:r>
-      <w:r>
-        <w:t xml:space="preserve"> </w:t>
-      </w:r>
-      <w:r>
-        <w:t xml:space="preserve">Estimation steps (05–09) cover the M0–M8 nested sequence, the Lind–Mehlum turning-point</w:t>
-      </w:r>
-      <w:r>
-        <w:t xml:space="preserve"> </w:t>
-      </w:r>
-      <w:r>
-        <w:t xml:space="preserve">check, manual Heckman selection probes, Paternoster et al. (1998) cross-wave z-tests, and the</w:t>
-      </w:r>
-      <w:r>
-        <w:t xml:space="preserve"> </w:t>
-      </w:r>
-      <w:r>
-        <w:t xml:space="preserve">robustness panels described in 4.5. The export step (10) writes the manuscript-facing tables</w:t>
-      </w:r>
-      <w:r>
-        <w:t xml:space="preserve"> </w:t>
-      </w:r>
-      <w:r>
-        <w:t xml:space="preserve">and Figure 2 directly from the stored estimates.</w:t>
-      </w:r>
-    </w:p>
-    <w:p>
-      <w:pPr>
-        <w:pStyle w:val="BodyText"/>
-      </w:pPr>
-      <w:r>
-        <w:t xml:space="preserve">Rerunning the pipeline from a fresh clone reproduces every coefficient reported below; the manuscript text rather than the do-file output is</w:t>
-      </w:r>
-      <w:r>
-        <w:t xml:space="preserve"> </w:t>
-      </w:r>
-      <w:r>
-        <w:t xml:space="preserve">the object that adjusts when the rerun drifts from the prose. Throughout, we follow current bestpractice recommendations on data preparation, transparency, and the cumulative interpretation</w:t>
-      </w:r>
-      <w:r>
-        <w:t xml:space="preserve"> </w:t>
-      </w:r>
-      <w:r>
-        <w:t xml:space="preserve">of associational evidence (Aguinis et al., 2021; Shaver, 2020).</w:t>
-      </w:r>
-    </w:p>
-    <w:bookmarkEnd w:id="40"/>
-    <w:bookmarkEnd w:id="41"/>
-    <w:bookmarkStart w:id="49" w:name="X121719332867ee227f0a04b486098cee978c6e6"/>
-    <w:p>
-      <w:pPr>
-        <w:pStyle w:val="Heading2"/>
-      </w:pPr>
-      <w:r>
-        <w:t xml:space="preserve">4. Results</w:t>
-      </w:r>
-    </w:p>
-    <w:p>
-      <w:pPr>
-        <w:pStyle w:val="FirstParagraph"/>
-      </w:pPr>
-      <w:r>
         <w:t xml:space="preserve">Table 2 reports analytic-sample summary statistics by wave. Three patterns stand out</w:t>
       </w:r>
       <w:r>
@@ -3537,7 +3494,7 @@
         <w:t xml:space="preserve">/ 20.55), consistent with broader Vietnamese productivity convergence over the period.</w:t>
       </w:r>
     </w:p>
-    <w:bookmarkStart w:id="43" w:name="X0cdd773083ddb6504e3d3ab10ff1c76267ec612"/>
+    <w:bookmarkStart w:id="42" w:name="X0cdd773083ddb6504e3d3ab10ff1c76267ec612"/>
     <w:p>
       <w:pPr>
         <w:pStyle w:val="Heading3"/>
@@ -4182,7 +4139,7 @@
       <w:r>
         <w:t xml:space="preserve"> </w:t>
       </w:r>
-      <w:hyperlink r:id="rId42">
+      <w:hyperlink r:id="rId41">
         <w:r>
           <w:rPr>
             <w:rStyle w:val="Hyperlink"/>
@@ -4447,8 +4404,8 @@
         <w:t xml:space="preserve">higher export intensity rather than uniformly across the export-intensity range.</w:t>
       </w:r>
     </w:p>
-    <w:bookmarkEnd w:id="43"/>
-    <w:bookmarkStart w:id="44" w:name="Xaa4851a9c1b3e08eeca0ab72ae930e2b05bff75"/>
+    <w:bookmarkEnd w:id="42"/>
+    <w:bookmarkStart w:id="55" w:name="Xaa4851a9c1b3e08eeca0ab72ae930e2b05bff75"/>
     <w:p>
       <w:pPr>
         <w:pStyle w:val="Heading3"/>
@@ -5081,7 +5038,46 @@
         <w:pStyle w:val="BodyText"/>
       </w:pPr>
       <w:r>
-        <w:t xml:space="preserve">Figure 2a: Wave 2009 — predicted ln(labour productivity) vs FSTS</w:t>
+        <w:drawing>
+          <wp:inline>
+            <wp:extent cx="5753100" cy="3835399"/>
+            <wp:effectExtent b="0" l="0" r="0" t="0"/>
+            <wp:docPr descr="Figure 2a: Wave 2009 — predicted ln(labour productivity) vs FSTS" title="" id="44" name="Picture"/>
+            <a:graphic>
+              <a:graphicData uri="http://schemas.openxmlformats.org/drawingml/2006/picture">
+                <pic:pic>
+                  <pic:nvPicPr>
+                    <pic:cNvPr descr="figures/vietnam/figure_2a.png" id="45" name="Picture"/>
+                    <pic:cNvPicPr>
+                      <a:picLocks noChangeArrowheads="1" noChangeAspect="1"/>
+                    </pic:cNvPicPr>
+                  </pic:nvPicPr>
+                  <pic:blipFill>
+                    <a:blip r:embed="rId43"/>
+                    <a:stretch>
+                      <a:fillRect/>
+                    </a:stretch>
+                  </pic:blipFill>
+                  <pic:spPr bwMode="auto">
+                    <a:xfrm>
+                      <a:off x="0" y="0"/>
+                      <a:ext cx="5753100" cy="3835399"/>
+                    </a:xfrm>
+                    <a:prstGeom prst="rect">
+                      <a:avLst/>
+                    </a:prstGeom>
+                    <a:noFill/>
+                    <a:ln w="9525">
+                      <a:noFill/>
+                      <a:headEnd/>
+                      <a:tailEnd/>
+                    </a:ln>
+                  </pic:spPr>
+                </pic:pic>
+              </a:graphicData>
+            </a:graphic>
+          </wp:inline>
+        </w:drawing>
       </w:r>
     </w:p>
     <w:p>
@@ -5107,7 +5103,46 @@
         <w:pStyle w:val="BodyText"/>
       </w:pPr>
       <w:r>
-        <w:t xml:space="preserve">Figure 2b: Wave 2015 — predicted ln(labour productivity) vs FSTS</w:t>
+        <w:drawing>
+          <wp:inline>
+            <wp:extent cx="5753100" cy="3835399"/>
+            <wp:effectExtent b="0" l="0" r="0" t="0"/>
+            <wp:docPr descr="Figure 2b: Wave 2015 — predicted ln(labour productivity) vs FSTS" title="" id="47" name="Picture"/>
+            <a:graphic>
+              <a:graphicData uri="http://schemas.openxmlformats.org/drawingml/2006/picture">
+                <pic:pic>
+                  <pic:nvPicPr>
+                    <pic:cNvPr descr="figures/vietnam/figure_2b.png" id="48" name="Picture"/>
+                    <pic:cNvPicPr>
+                      <a:picLocks noChangeArrowheads="1" noChangeAspect="1"/>
+                    </pic:cNvPicPr>
+                  </pic:nvPicPr>
+                  <pic:blipFill>
+                    <a:blip r:embed="rId46"/>
+                    <a:stretch>
+                      <a:fillRect/>
+                    </a:stretch>
+                  </pic:blipFill>
+                  <pic:spPr bwMode="auto">
+                    <a:xfrm>
+                      <a:off x="0" y="0"/>
+                      <a:ext cx="5753100" cy="3835399"/>
+                    </a:xfrm>
+                    <a:prstGeom prst="rect">
+                      <a:avLst/>
+                    </a:prstGeom>
+                    <a:noFill/>
+                    <a:ln w="9525">
+                      <a:noFill/>
+                      <a:headEnd/>
+                      <a:tailEnd/>
+                    </a:ln>
+                  </pic:spPr>
+                </pic:pic>
+              </a:graphicData>
+            </a:graphic>
+          </wp:inline>
+        </w:drawing>
       </w:r>
     </w:p>
     <w:p>
@@ -5133,7 +5168,46 @@
         <w:pStyle w:val="BodyText"/>
       </w:pPr>
       <w:r>
-        <w:t xml:space="preserve">Figure 2c: Wave 2023 — predicted ln(labour productivity) vs FSTS</w:t>
+        <w:drawing>
+          <wp:inline>
+            <wp:extent cx="5753100" cy="3835399"/>
+            <wp:effectExtent b="0" l="0" r="0" t="0"/>
+            <wp:docPr descr="Figure 2c: Wave 2023 — predicted ln(labour productivity) vs FSTS" title="" id="50" name="Picture"/>
+            <a:graphic>
+              <a:graphicData uri="http://schemas.openxmlformats.org/drawingml/2006/picture">
+                <pic:pic>
+                  <pic:nvPicPr>
+                    <pic:cNvPr descr="figures/vietnam/figure_2c.png" id="51" name="Picture"/>
+                    <pic:cNvPicPr>
+                      <a:picLocks noChangeArrowheads="1" noChangeAspect="1"/>
+                    </pic:cNvPicPr>
+                  </pic:nvPicPr>
+                  <pic:blipFill>
+                    <a:blip r:embed="rId49"/>
+                    <a:stretch>
+                      <a:fillRect/>
+                    </a:stretch>
+                  </pic:blipFill>
+                  <pic:spPr bwMode="auto">
+                    <a:xfrm>
+                      <a:off x="0" y="0"/>
+                      <a:ext cx="5753100" cy="3835399"/>
+                    </a:xfrm>
+                    <a:prstGeom prst="rect">
+                      <a:avLst/>
+                    </a:prstGeom>
+                    <a:noFill/>
+                    <a:ln w="9525">
+                      <a:noFill/>
+                      <a:headEnd/>
+                      <a:tailEnd/>
+                    </a:ln>
+                  </pic:spPr>
+                </pic:pic>
+              </a:graphicData>
+            </a:graphic>
+          </wp:inline>
+        </w:drawing>
       </w:r>
     </w:p>
     <w:p>
@@ -5159,7 +5233,46 @@
         <w:pStyle w:val="BodyText"/>
       </w:pPr>
       <w:r>
-        <w:t xml:space="preserve">Figure 2d: Pooled (2009+2015+2023) — predicted ln(labour productivity) vs FSTS</w:t>
+        <w:drawing>
+          <wp:inline>
+            <wp:extent cx="5753100" cy="3835399"/>
+            <wp:effectExtent b="0" l="0" r="0" t="0"/>
+            <wp:docPr descr="Figure 2d: Pooled (2009+2015+2023) — predicted ln(labour productivity) vs FSTS" title="" id="53" name="Picture"/>
+            <a:graphic>
+              <a:graphicData uri="http://schemas.openxmlformats.org/drawingml/2006/picture">
+                <pic:pic>
+                  <pic:nvPicPr>
+                    <pic:cNvPr descr="figures/vietnam/figure_2d.png" id="54" name="Picture"/>
+                    <pic:cNvPicPr>
+                      <a:picLocks noChangeArrowheads="1" noChangeAspect="1"/>
+                    </pic:cNvPicPr>
+                  </pic:nvPicPr>
+                  <pic:blipFill>
+                    <a:blip r:embed="rId52"/>
+                    <a:stretch>
+                      <a:fillRect/>
+                    </a:stretch>
+                  </pic:blipFill>
+                  <pic:spPr bwMode="auto">
+                    <a:xfrm>
+                      <a:off x="0" y="0"/>
+                      <a:ext cx="5753100" cy="3835399"/>
+                    </a:xfrm>
+                    <a:prstGeom prst="rect">
+                      <a:avLst/>
+                    </a:prstGeom>
+                    <a:noFill/>
+                    <a:ln w="9525">
+                      <a:noFill/>
+                      <a:headEnd/>
+                      <a:tailEnd/>
+                    </a:ln>
+                  </pic:spPr>
+                </pic:pic>
+              </a:graphicData>
+            </a:graphic>
+          </wp:inline>
+        </w:drawing>
       </w:r>
     </w:p>
     <w:p>
@@ -5180,8 +5293,8 @@
         <w:t xml:space="preserve">Predicted ln(labour productivity) as a function of FSTS for the pooled sample (M2). Turning point ≈ 40% FSTS (Lind-Mehlum p &lt; .001).</w:t>
       </w:r>
     </w:p>
-    <w:bookmarkEnd w:id="44"/>
-    <w:bookmarkStart w:id="45" w:name="X41c3dce096fbfa1c0be6a58d0741b2aa56fb860"/>
+    <w:bookmarkEnd w:id="55"/>
+    <w:bookmarkStart w:id="59" w:name="X41c3dce096fbfa1c0be6a58d0741b2aa56fb860"/>
     <w:p>
       <w:pPr>
         <w:pStyle w:val="Heading3"/>
@@ -5335,7 +5448,46 @@
         <w:pStyle w:val="BodyText"/>
       </w:pPr>
       <w:r>
-        <w:t xml:space="preserve">Figure 3: Moderator marginal effects — TCI and DAI interactions with FSTS (Vietnam)</w:t>
+        <w:drawing>
+          <wp:inline>
+            <wp:extent cx="5753100" cy="2401293"/>
+            <wp:effectExtent b="0" l="0" r="0" t="0"/>
+            <wp:docPr descr="Figure 3: Moderator marginal effects — TCI and DAI interactions with FSTS (Vietnam)" title="" id="57" name="Picture"/>
+            <a:graphic>
+              <a:graphicData uri="http://schemas.openxmlformats.org/drawingml/2006/picture">
+                <pic:pic>
+                  <pic:nvPicPr>
+                    <pic:cNvPr descr="figures/vietnam/figure_3_moderator_marginals.png" id="58" name="Picture"/>
+                    <pic:cNvPicPr>
+                      <a:picLocks noChangeArrowheads="1" noChangeAspect="1"/>
+                    </pic:cNvPicPr>
+                  </pic:nvPicPr>
+                  <pic:blipFill>
+                    <a:blip r:embed="rId56"/>
+                    <a:stretch>
+                      <a:fillRect/>
+                    </a:stretch>
+                  </pic:blipFill>
+                  <pic:spPr bwMode="auto">
+                    <a:xfrm>
+                      <a:off x="0" y="0"/>
+                      <a:ext cx="5753100" cy="2401293"/>
+                    </a:xfrm>
+                    <a:prstGeom prst="rect">
+                      <a:avLst/>
+                    </a:prstGeom>
+                    <a:noFill/>
+                    <a:ln w="9525">
+                      <a:noFill/>
+                      <a:headEnd/>
+                      <a:tailEnd/>
+                    </a:ln>
+                  </pic:spPr>
+                </pic:pic>
+              </a:graphicData>
+            </a:graphic>
+          </wp:inline>
+        </w:drawing>
       </w:r>
     </w:p>
     <w:p>
@@ -5356,8 +5508,8 @@
         <w:t xml:space="preserve">Marginal effects of TCI_z and DAI_z on ln(labour productivity) across FSTS levels (M7/M8). TCI shows a stable positive level-shift across waves; DAI moderation is wave-specific, with the 2023 interaction showing attenuation at high FSTS (Type I moderation: slope-flattening, shape preserved).</w:t>
       </w:r>
     </w:p>
-    <w:bookmarkEnd w:id="45"/>
-    <w:bookmarkStart w:id="46" w:name="X3b4c7e0874095eca8ced8b4f3eaf74e392e9461"/>
+    <w:bookmarkEnd w:id="59"/>
+    <w:bookmarkStart w:id="60" w:name="X3b4c7e0874095eca8ced8b4f3eaf74e392e9461"/>
     <w:p>
       <w:pPr>
         <w:pStyle w:val="Heading3"/>
@@ -5428,8 +5580,8 @@
         <w:t xml:space="preserve">Table 3 summarises the directional interpretation of the focal coefficients from the full specifications by wave and for the pooled sample.</w:t>
       </w:r>
     </w:p>
-    <w:bookmarkEnd w:id="46"/>
-    <w:bookmarkStart w:id="48" w:name="Xa4c02e0b9d1c1dfbd229ca8e93a765eb24721f0"/>
+    <w:bookmarkEnd w:id="60"/>
+    <w:bookmarkStart w:id="62" w:name="Xa4c02e0b9d1c1dfbd229ca8e93a765eb24721f0"/>
     <w:p>
       <w:pPr>
         <w:pStyle w:val="Heading3"/>
@@ -5710,7 +5862,7 @@
         <w:t xml:space="preserve">turning-point magnitude.</w:t>
       </w:r>
     </w:p>
-    <w:bookmarkStart w:id="47" w:name="robustness-to-endogeneity-and-selection"/>
+    <w:bookmarkStart w:id="61" w:name="robustness-to-endogeneity-and-selection"/>
     <w:p>
       <w:pPr>
         <w:pStyle w:val="Heading4"/>
@@ -17132,7 +17284,7 @@
       <w:r>
         <w:t xml:space="preserve"> </w:t>
       </w:r>
-      <w:hyperlink r:id="rId42">
+      <w:hyperlink r:id="rId41">
         <w:r>
           <w:rPr>
             <w:rStyle w:val="Hyperlink"/>
@@ -17803,10 +17955,10 @@
         <w:t xml:space="preserve">Cross-wave coefficient equality tests following Paternoster et al. (1998). Failure to reject indicates coefficient stability across waves. FSTSc and FSTSc² comparisons support wave-specific heterogeneity in TCI and DAI direct effects but not in the I–P curvature parameters. Turning points (already reported in Table 5 above) are derived from M2 (lnLP = β₀ + β₁ FSTS_c + β₂ FSTS_c² + controls + sector FE [+ wave FE in pooled]) back-transformed to the raw FSTS scale; 95% CI uses the delta method; Lind–Mehlum p-values follow the Sasabuchi-style endpoint test (Lind &amp; Mehlum, 2010). Source: WBES Vietnam 2009, 2015, 2023; authors' calculations.</w:t>
       </w:r>
     </w:p>
-    <w:bookmarkEnd w:id="47"/>
-    <w:bookmarkEnd w:id="48"/>
-    <w:bookmarkEnd w:id="49"/>
-    <w:bookmarkStart w:id="55" w:name="X735612638e4e736e4693e459c258977262c0dfc"/>
+    <w:bookmarkEnd w:id="61"/>
+    <w:bookmarkEnd w:id="62"/>
+    <w:bookmarkEnd w:id="63"/>
+    <w:bookmarkStart w:id="69" w:name="X735612638e4e736e4693e459c258977262c0dfc"/>
     <w:p>
       <w:pPr>
         <w:pStyle w:val="Heading2"/>
@@ -17823,7 +17975,7 @@
         <w:t xml:space="preserve">The results should first be located against the meta-analytic baseline. Wu, Fan, and Chen (2022, MIR) establish a positive average I–P relationship for emerging-market multinationals — a useful macro-level anchor, but one that aggregates across institutional contexts in which the functional form may vary substantially. Country-level heterogeneity in the I–P curve shape remains under-specified in that meta-analysis. Vietnam — as a single-party transitional economy with rapid but uneven digital infrastructure uptake — provides a critical test of whether the pooled meta-level estimate masks functional-form nonlinearity at the within-country level. The present evidence is consistent with that concern: the inverted-U is robust within Vietnam but is driven predominantly by a participation-margin step rather than by within-exporter saturation, a structure that pooling across exporters and non-exporters in cross-country meta-analyses would tend to inflate into an apparent continuous curvature. The within-Vietnam temporal durability of the threshold (39–46 % band sustained across 14 years) additionally indicates that institutional context — held constant in this single-country design — may stabilise the curve shape in a way that cross-country designs cannot isolate. Our finding of a reproducible inverted-U at FSTS ≈ 39–46% in Vietnam, despite the cross-national skepticism articulated by Pisani, Garcia-Bernardo, and Heemskerk (2020, SMJ), is consistent with the view that single-country institutional contexts retain functional-form heterogeneity that pooled cross-national samples obscure through aggregation. The ascending-limb mechanism receives independent corroboration from matched firm-level customs panel evidence: Vietnamese firms that absorbed a positive US demand shock over 2018–2020 expanded exports to both US and non-US destinations and recorded commensurate gains in labour productivity, with demand-driven export expansion explaining 68.5 per cent of the observed domestic value-added ratio increase over the same period (Agarwal, Barattieri, &amp; Mattoo, 2026). This corroboration strengthens the interpretation that moderate export intensity generates genuine productivity gains in Vietnamese firms — not merely a compositional artefact of positive selection into exporting.</w:t>
       </w:r>
     </w:p>
-    <w:bookmarkStart w:id="50" w:name="Xa5f80b6bc0b8dd7b33d639445ac723c1ee9ad4a"/>
+    <w:bookmarkStart w:id="64" w:name="Xa5f80b6bc0b8dd7b33d639445ac723c1ee9ad4a"/>
     <w:p>
       <w:pPr>
         <w:pStyle w:val="Heading3"/>
@@ -17896,8 +18048,8 @@
         <w:t xml:space="preserve">stand in the broader trajectory of internationalisation and transition, as captured in repeated cross-sectional snapshots rather than within-firm longitudinal records.</w:t>
       </w:r>
     </w:p>
-    <w:bookmarkEnd w:id="50"/>
-    <w:bookmarkStart w:id="51" w:name="Xa30cb53845d80e9f381e97d931a6564a08369b5"/>
+    <w:bookmarkEnd w:id="64"/>
+    <w:bookmarkStart w:id="65" w:name="Xa30cb53845d80e9f381e97d931a6564a08369b5"/>
     <w:p>
       <w:pPr>
         <w:pStyle w:val="Heading3"/>
@@ -18108,8 +18260,8 @@
         <w:t xml:space="preserve">a single label.</w:t>
       </w:r>
     </w:p>
-    <w:bookmarkEnd w:id="51"/>
-    <w:bookmarkStart w:id="52" w:name="X946dfeb74c2174371e94edd51e868f8bb309c10"/>
+    <w:bookmarkEnd w:id="65"/>
+    <w:bookmarkStart w:id="66" w:name="X946dfeb74c2174371e94edd51e868f8bb309c10"/>
     <w:p>
       <w:pPr>
         <w:pStyle w:val="Heading3"/>
@@ -18412,8 +18564,8 @@
         <w:t xml:space="preserve">indistinguishable across waves.</w:t>
       </w:r>
     </w:p>
-    <w:bookmarkEnd w:id="52"/>
-    <w:bookmarkStart w:id="53" w:name="Xd9a4ebc909e2b14dcfe03b7b8686207326328b4"/>
+    <w:bookmarkEnd w:id="66"/>
+    <w:bookmarkStart w:id="67" w:name="Xd9a4ebc909e2b14dcfe03b7b8686207326328b4"/>
     <w:p>
       <w:pPr>
         <w:pStyle w:val="Heading3"/>
@@ -18532,8 +18684,8 @@
         <w:t xml:space="preserve">Two cross-cutting principles emerge. First, managers should avoid conflating basic digital adoption with deeper technological capability — the constructs do not behave identically across periods or under identification-robust estimation, and Tier-1 digital expenditure does not substitute for the foreign-technology, standards, and process-integration investments that the TCI channel reflects. Second, allocation decisions should be staged against the empirically identified thresholds rather than against generic digital-transformation prescriptions: investment in incremental Tier-1 presence at high export intensity may absorb scarce capital with limited productivity return, while investment in TCI-channel capability around the 39–46 % band corresponds to where the cross-wave evidence is most consistent with a productivity-enhancing effect. The threshold-conditioned framing translates the step-function and Tier-1 saturation findings into actionable allocation guidance without overstating the causal status of the cross-sectional coefficients.</w:t>
       </w:r>
     </w:p>
-    <w:bookmarkEnd w:id="53"/>
-    <w:bookmarkStart w:id="54" w:name="X0d482379a65faf52764848d2b168aee0725ece4"/>
+    <w:bookmarkEnd w:id="67"/>
+    <w:bookmarkStart w:id="68" w:name="X0d482379a65faf52764848d2b168aee0725ece4"/>
     <w:p>
       <w:pPr>
         <w:pStyle w:val="Heading3"/>
@@ -18696,9 +18848,9 @@
         <w:t xml:space="preserve">update identifies the cultivation of high-tech industrial talent as a binding constraint mediating digital and capability investment into sustainable productivity gains — reinforcing the argument that policy evaluation in transitional settings must monitor the capability environment, not adoption rates alone. At the macro level, Vietnam's service trade liberalization over 2008–2016 raised service-sector productivity by an average of 2.9 per cent per year and manufacturing productivity by 3.1 per cent per year (Barattieri, Mattoo, &amp; Signoret, 2026), suggesting that the ascending limb documented in the WBES microdata reflects in part the economy-wide gains from trade opening that firm-level capability investments convert into sustained productivity advantage.</w:t>
       </w:r>
     </w:p>
-    <w:bookmarkEnd w:id="54"/>
-    <w:bookmarkEnd w:id="55"/>
-    <w:bookmarkStart w:id="56" w:name="Xf3d63d3bef15b3e862b66ed5bd48a577996a1bc"/>
+    <w:bookmarkEnd w:id="68"/>
+    <w:bookmarkEnd w:id="69"/>
+    <w:bookmarkStart w:id="70" w:name="Xf3d63d3bef15b3e862b66ed5bd48a577996a1bc"/>
     <w:p>
       <w:pPr>
         <w:pStyle w:val="Heading2"/>
@@ -18877,8 +19029,8 @@
         <w:t xml:space="preserve">Sixth, the analysis is limited to Vietnam as a single transitional economy at a particular stage of its digital and institutional development. Understanding how the DAI moderation pattern documented here — negative at high export intensity under Tier-1-only adoption — compares with patterns in other emerging markets at different institutional stages, or with patterns in digitally advanced economies where the same interaction is predicted to be positive, requires cross-setting comparative designs that systematically vary institutional transaction costs and digital infrastructure quality. Such designs would also allow more direct tests of the context-contingent framing developed in §2.1.</w:t>
       </w:r>
     </w:p>
-    <w:bookmarkEnd w:id="56"/>
-    <w:bookmarkStart w:id="57" w:name="X19cad7d15381a9dfa000caf49ac5c69889e188d"/>
+    <w:bookmarkEnd w:id="70"/>
+    <w:bookmarkStart w:id="71" w:name="X19cad7d15381a9dfa000caf49ac5c69889e188d"/>
     <w:p>
       <w:pPr>
         <w:pStyle w:val="Heading2"/>
@@ -18911,8 +19063,8 @@
         <w:t xml:space="preserve">The results also suggest that technological capability and the baseline website-presence indicator should not be treated as interchangeable, and that conflating them under a single "digital adoption" or "digital transformation" label would obscure their differing identification properties. Technological capability is comparatively stable and identification-robust across specifications. The baseline DAI_z control is more wave-sensitive and attenuates to a null under instrumental-variable estimation, consistent with Tier-1 proxy obsolescence as website ownership diffuses to near-universal levels in the Vietnamese firm population. Within the constraint of a single binary website indicator, this paper makes no claim about dynamic digital capability moderation; any such test awaits richer Tier 2–4 indicators not currently available cross-wave in the WBES Vietnam instrument.</w:t>
       </w:r>
     </w:p>
-    <w:bookmarkEnd w:id="57"/>
-    <w:bookmarkStart w:id="58" w:name="conflict-of-interest"/>
+    <w:bookmarkEnd w:id="71"/>
+    <w:bookmarkStart w:id="72" w:name="conflict-of-interest"/>
     <w:p>
       <w:pPr>
         <w:pStyle w:val="Heading2"/>
@@ -18929,8 +19081,8 @@
         <w:t xml:space="preserve">The authors declare no conflict of interest.</w:t>
       </w:r>
     </w:p>
-    <w:bookmarkEnd w:id="58"/>
-    <w:bookmarkStart w:id="59" w:name="funding"/>
+    <w:bookmarkEnd w:id="72"/>
+    <w:bookmarkStart w:id="73" w:name="funding"/>
     <w:p>
       <w:pPr>
         <w:pStyle w:val="Heading2"/>
@@ -18953,8 +19105,8 @@
         <w:t xml:space="preserve">not-for-profit sectors.</w:t>
       </w:r>
     </w:p>
-    <w:bookmarkEnd w:id="59"/>
-    <w:bookmarkStart w:id="60" w:name="data-availability-statement"/>
+    <w:bookmarkEnd w:id="73"/>
+    <w:bookmarkStart w:id="74" w:name="data-availability-statement"/>
     <w:p>
       <w:pPr>
         <w:pStyle w:val="Heading2"/>
@@ -19001,8 +19153,8 @@
         <w:t xml:space="preserve">and may be shared to the extent permitted by the data-access terms.</w:t>
       </w:r>
     </w:p>
-    <w:bookmarkEnd w:id="60"/>
-    <w:bookmarkStart w:id="61" w:name="X799c23334c5944d058eaf15944a1408ff96b683"/>
+    <w:bookmarkEnd w:id="74"/>
+    <w:bookmarkStart w:id="75" w:name="X799c23334c5944d058eaf15944a1408ff96b683"/>
     <w:p>
       <w:pPr>
         <w:pStyle w:val="Heading2"/>
@@ -19053,8 +19205,8 @@
         <w:t xml:space="preserve">publication.</w:t>
       </w:r>
     </w:p>
-    <w:bookmarkEnd w:id="61"/>
-    <w:bookmarkStart w:id="62" w:name="acknowledgements"/>
+    <w:bookmarkEnd w:id="75"/>
+    <w:bookmarkStart w:id="76" w:name="acknowledgements"/>
     <w:p>
       <w:pPr>
         <w:pStyle w:val="Heading2"/>
@@ -19133,8 +19285,8 @@
         <w:t xml:space="preserve">and computational reproducibility.</w:t>
       </w:r>
     </w:p>
-    <w:bookmarkEnd w:id="62"/>
-    <w:bookmarkStart w:id="63" w:name="supplementary-materials"/>
+    <w:bookmarkEnd w:id="76"/>
+    <w:bookmarkStart w:id="77" w:name="supplementary-materials"/>
     <w:p>
       <w:pPr>
         <w:pStyle w:val="Heading2"/>
@@ -19186,8 +19338,8 @@
         </w:pict>
       </w:r>
     </w:p>
-    <w:bookmarkEnd w:id="63"/>
-    <w:bookmarkStart w:id="113" w:name="references"/>
+    <w:bookmarkEnd w:id="77"/>
+    <w:bookmarkStart w:id="133" w:name="references"/>
     <w:p>
       <w:pPr>
         <w:pStyle w:val="Heading2"/>
@@ -19200,6 +19352,28 @@
       <w:pPr>
         <w:pStyle w:val="FirstParagraph"/>
       </w:pPr>
+      <w:r>
+        <w:t xml:space="preserve">Agarwal, R., Barattieri, A., &amp; Mattoo, A. (2026).</w:t>
+      </w:r>
+      <w:r>
+        <w:t xml:space="preserve"> </w:t>
+      </w:r>
+      <w:r>
+        <w:rPr>
+          <w:iCs/>
+          <w:i/>
+        </w:rPr>
+        <w:t xml:space="preserve">Demand shocks, export expansion, and firm-level productivity: Evidence from Vietnamese manufacturers</w:t>
+      </w:r>
+      <w:r>
+        <w:t xml:space="preserve"> </w:t>
+      </w:r>
+      <w:r>
+        <w:t xml:space="preserve">[World Bank Policy Research Working Paper]. The World Bank. [DOI pending; verify and add upon assignment before submission]</w:t>
+      </w:r>
+      <w:r>
+        <w:t xml:space="preserve"> </w:t>
+      </w:r>
       <w:r>
         <w:t xml:space="preserve">Aguinis, H., Hill, N. S., &amp; Bailey, J. R. (2021). Best practices in data collection and preparation: Recommendations for reviewers, editors, and authors.</w:t>
       </w:r>
@@ -19219,7 +19393,7 @@
       <w:r>
         <w:t xml:space="preserve"> </w:t>
       </w:r>
-      <w:hyperlink r:id="rId64">
+      <w:hyperlink r:id="rId78">
         <w:r>
           <w:rPr>
             <w:rStyle w:val="Hyperlink"/>
@@ -19249,7 +19423,7 @@
       <w:r>
         <w:t xml:space="preserve"> </w:t>
       </w:r>
-      <w:hyperlink r:id="rId65">
+      <w:hyperlink r:id="rId79">
         <w:r>
           <w:rPr>
             <w:rStyle w:val="Hyperlink"/>
@@ -19279,7 +19453,7 @@
       <w:r>
         <w:t xml:space="preserve"> </w:t>
       </w:r>
-      <w:hyperlink r:id="rId66">
+      <w:hyperlink r:id="rId80">
         <w:r>
           <w:rPr>
             <w:rStyle w:val="Hyperlink"/>
@@ -19291,6 +19465,58 @@
         <w:t xml:space="preserve"> </w:t>
       </w:r>
       <w:r>
+        <w:t xml:space="preserve">Barattieri, A., Mattoo, A., &amp; Signoret, J. E. (2026).</w:t>
+      </w:r>
+      <w:r>
+        <w:t xml:space="preserve"> </w:t>
+      </w:r>
+      <w:r>
+        <w:rPr>
+          <w:iCs/>
+          <w:i/>
+        </w:rPr>
+        <w:t xml:space="preserve">Service trade liberalization and productivity growth: Micro-evidence from Vietnam, 2008–2016</w:t>
+      </w:r>
+      <w:r>
+        <w:t xml:space="preserve"> </w:t>
+      </w:r>
+      <w:r>
+        <w:t xml:space="preserve">[World Bank Policy Research Working Paper]. The World Bank. [DOI pending; verify and add upon assignment before submission]</w:t>
+      </w:r>
+      <w:r>
+        <w:t xml:space="preserve"> </w:t>
+      </w:r>
+      <w:r>
+        <w:t xml:space="preserve">Barney, J. (1991). Firm resources and sustained competitive advantage.</w:t>
+      </w:r>
+      <w:r>
+        <w:t xml:space="preserve"> </w:t>
+      </w:r>
+      <w:r>
+        <w:rPr>
+          <w:iCs/>
+          <w:i/>
+        </w:rPr>
+        <w:t xml:space="preserve">Journal of Management, 17</w:t>
+      </w:r>
+      <w:r>
+        <w:t xml:space="preserve">(1), 99–120.</w:t>
+      </w:r>
+      <w:r>
+        <w:t xml:space="preserve"> </w:t>
+      </w:r>
+      <w:hyperlink r:id="rId81">
+        <w:r>
+          <w:rPr>
+            <w:rStyle w:val="Hyperlink"/>
+          </w:rPr>
+          <w:t xml:space="preserve">https://doi.org/10.1177/014920639101700108</w:t>
+        </w:r>
+      </w:hyperlink>
+      <w:r>
+        <w:t xml:space="preserve"> </w:t>
+      </w:r>
+      <w:r>
         <w:t xml:space="preserve">Bernard, A. B., Jensen, J. B., Redding, S. J., &amp; Schott, P. K. (2007). Firms in international trade.</w:t>
       </w:r>
       <w:r>
@@ -19309,7 +19535,7 @@
       <w:r>
         <w:t xml:space="preserve"> </w:t>
       </w:r>
-      <w:hyperlink r:id="rId67">
+      <w:hyperlink r:id="rId82">
         <w:r>
           <w:rPr>
             <w:rStyle w:val="Hyperlink"/>
@@ -19339,7 +19565,7 @@
       <w:r>
         <w:t xml:space="preserve"> </w:t>
       </w:r>
-      <w:hyperlink r:id="rId68">
+      <w:hyperlink r:id="rId83">
         <w:r>
           <w:rPr>
             <w:rStyle w:val="Hyperlink"/>
@@ -19369,7 +19595,7 @@
       <w:r>
         <w:t xml:space="preserve"> </w:t>
       </w:r>
-      <w:hyperlink r:id="rId69">
+      <w:hyperlink r:id="rId84">
         <w:r>
           <w:rPr>
             <w:rStyle w:val="Hyperlink"/>
@@ -19399,7 +19625,7 @@
       <w:r>
         <w:t xml:space="preserve"> </w:t>
       </w:r>
-      <w:hyperlink r:id="rId70">
+      <w:hyperlink r:id="rId85">
         <w:r>
           <w:rPr>
             <w:rStyle w:val="Hyperlink"/>
@@ -19429,7 +19655,7 @@
       <w:r>
         <w:t xml:space="preserve"> </w:t>
       </w:r>
-      <w:hyperlink r:id="rId71">
+      <w:hyperlink r:id="rId86">
         <w:r>
           <w:rPr>
             <w:rStyle w:val="Hyperlink"/>
@@ -19459,7 +19685,7 @@
       <w:r>
         <w:t xml:space="preserve"> </w:t>
       </w:r>
-      <w:hyperlink r:id="rId72">
+      <w:hyperlink r:id="rId87">
         <w:r>
           <w:rPr>
             <w:rStyle w:val="Hyperlink"/>
@@ -19489,7 +19715,7 @@
       <w:r>
         <w:t xml:space="preserve"> </w:t>
       </w:r>
-      <w:hyperlink r:id="rId73">
+      <w:hyperlink r:id="rId88">
         <w:r>
           <w:rPr>
             <w:rStyle w:val="Hyperlink"/>
@@ -19519,7 +19745,7 @@
       <w:r>
         <w:t xml:space="preserve"> </w:t>
       </w:r>
-      <w:hyperlink r:id="rId74">
+      <w:hyperlink r:id="rId89">
         <w:r>
           <w:rPr>
             <w:rStyle w:val="Hyperlink"/>
@@ -19549,7 +19775,7 @@
       <w:r>
         <w:t xml:space="preserve"> </w:t>
       </w:r>
-      <w:hyperlink r:id="rId75">
+      <w:hyperlink r:id="rId90">
         <w:r>
           <w:rPr>
             <w:rStyle w:val="Hyperlink"/>
@@ -19579,7 +19805,7 @@
       <w:r>
         <w:t xml:space="preserve"> </w:t>
       </w:r>
-      <w:hyperlink r:id="rId76">
+      <w:hyperlink r:id="rId91">
         <w:r>
           <w:rPr>
             <w:rStyle w:val="Hyperlink"/>
@@ -19609,7 +19835,7 @@
       <w:r>
         <w:t xml:space="preserve"> </w:t>
       </w:r>
-      <w:hyperlink r:id="rId77">
+      <w:hyperlink r:id="rId92">
         <w:r>
           <w:rPr>
             <w:rStyle w:val="Hyperlink"/>
@@ -19639,7 +19865,7 @@
       <w:r>
         <w:t xml:space="preserve"> </w:t>
       </w:r>
-      <w:hyperlink r:id="rId78">
+      <w:hyperlink r:id="rId93">
         <w:r>
           <w:rPr>
             <w:rStyle w:val="Hyperlink"/>
@@ -19669,7 +19895,7 @@
       <w:r>
         <w:t xml:space="preserve"> </w:t>
       </w:r>
-      <w:hyperlink r:id="rId79">
+      <w:hyperlink r:id="rId94">
         <w:r>
           <w:rPr>
             <w:rStyle w:val="Hyperlink"/>
@@ -19699,7 +19925,7 @@
       <w:r>
         <w:t xml:space="preserve"> </w:t>
       </w:r>
-      <w:hyperlink r:id="rId80">
+      <w:hyperlink r:id="rId95">
         <w:r>
           <w:rPr>
             <w:rStyle w:val="Hyperlink"/>
@@ -19729,7 +19955,7 @@
       <w:r>
         <w:t xml:space="preserve"> </w:t>
       </w:r>
-      <w:hyperlink r:id="rId81">
+      <w:hyperlink r:id="rId96">
         <w:r>
           <w:rPr>
             <w:rStyle w:val="Hyperlink"/>
@@ -19759,7 +19985,7 @@
       <w:r>
         <w:t xml:space="preserve"> </w:t>
       </w:r>
-      <w:hyperlink r:id="rId82">
+      <w:hyperlink r:id="rId97">
         <w:r>
           <w:rPr>
             <w:rStyle w:val="Hyperlink"/>
@@ -19771,6 +19997,36 @@
         <w:t xml:space="preserve"> </w:t>
       </w:r>
       <w:r>
+        <w:t xml:space="preserve">Hitt, M. A., Hoskisson, R. E., &amp; Kim, H. (1997). International diversification: Effects on innovation and firm performance in product-diversified firms.</w:t>
+      </w:r>
+      <w:r>
+        <w:t xml:space="preserve"> </w:t>
+      </w:r>
+      <w:r>
+        <w:rPr>
+          <w:iCs/>
+          <w:i/>
+        </w:rPr>
+        <w:t xml:space="preserve">Academy of Management Journal, 40</w:t>
+      </w:r>
+      <w:r>
+        <w:t xml:space="preserve">(4), 767–798.</w:t>
+      </w:r>
+      <w:r>
+        <w:t xml:space="preserve"> </w:t>
+      </w:r>
+      <w:hyperlink r:id="rId98">
+        <w:r>
+          <w:rPr>
+            <w:rStyle w:val="Hyperlink"/>
+          </w:rPr>
+          <w:t xml:space="preserve">https://doi.org/10.5465/256948</w:t>
+        </w:r>
+      </w:hyperlink>
+      <w:r>
+        <w:t xml:space="preserve"> </w:t>
+      </w:r>
+      <w:r>
         <w:t xml:space="preserve">International Telecommunication Union. (2026).</w:t>
       </w:r>
       <w:r>
@@ -19792,7 +20048,7 @@
       <w:r>
         <w:t xml:space="preserve"> </w:t>
       </w:r>
-      <w:hyperlink r:id="rId83">
+      <w:hyperlink r:id="rId99">
         <w:r>
           <w:rPr>
             <w:rStyle w:val="Hyperlink"/>
@@ -19804,6 +20060,66 @@
         <w:t xml:space="preserve"> </w:t>
       </w:r>
       <w:r>
+        <w:t xml:space="preserve">Johanson, J., &amp; Vahlne, J.-E. (1977). The internationalization process of the firm: A model of knowledge development and increasing foreign market commitments.</w:t>
+      </w:r>
+      <w:r>
+        <w:t xml:space="preserve"> </w:t>
+      </w:r>
+      <w:r>
+        <w:rPr>
+          <w:iCs/>
+          <w:i/>
+        </w:rPr>
+        <w:t xml:space="preserve">Journal of International Business Studies, 8</w:t>
+      </w:r>
+      <w:r>
+        <w:t xml:space="preserve">(1), 23–32.</w:t>
+      </w:r>
+      <w:r>
+        <w:t xml:space="preserve"> </w:t>
+      </w:r>
+      <w:hyperlink r:id="rId100">
+        <w:r>
+          <w:rPr>
+            <w:rStyle w:val="Hyperlink"/>
+          </w:rPr>
+          <w:t xml:space="preserve">https://doi.org/10.1057/palgrave.jibs.8490676</w:t>
+        </w:r>
+      </w:hyperlink>
+      <w:r>
+        <w:t xml:space="preserve"> </w:t>
+      </w:r>
+      <w:r>
+        <w:t xml:space="preserve">Johanson, J., &amp; Vahlne, J.-E. (2009). The Uppsala internationalization process model revisited: From liability of foreignness to liability of outsidership.</w:t>
+      </w:r>
+      <w:r>
+        <w:t xml:space="preserve"> </w:t>
+      </w:r>
+      <w:r>
+        <w:rPr>
+          <w:iCs/>
+          <w:i/>
+        </w:rPr>
+        <w:t xml:space="preserve">Journal of International Business Studies, 40</w:t>
+      </w:r>
+      <w:r>
+        <w:t xml:space="preserve">(9), 1411–1431.</w:t>
+      </w:r>
+      <w:r>
+        <w:t xml:space="preserve"> </w:t>
+      </w:r>
+      <w:hyperlink r:id="rId101">
+        <w:r>
+          <w:rPr>
+            <w:rStyle w:val="Hyperlink"/>
+          </w:rPr>
+          <w:t xml:space="preserve">https://doi.org/10.1057/jibs.2009.24</w:t>
+        </w:r>
+      </w:hyperlink>
+      <w:r>
+        <w:t xml:space="preserve"> </w:t>
+      </w:r>
+      <w:r>
         <w:t xml:space="preserve">Karna, A., Richter, A., &amp; Riesenkampff, E. (2016). Revisiting the role of the environment in the capabilities–financial performance relationship: A meta-analysis.</w:t>
       </w:r>
       <w:r>
@@ -19822,7 +20138,7 @@
       <w:r>
         <w:t xml:space="preserve"> </w:t>
       </w:r>
-      <w:hyperlink r:id="rId84">
+      <w:hyperlink r:id="rId102">
         <w:r>
           <w:rPr>
             <w:rStyle w:val="Hyperlink"/>
@@ -19852,7 +20168,7 @@
       <w:r>
         <w:t xml:space="preserve"> </w:t>
       </w:r>
-      <w:hyperlink r:id="rId85">
+      <w:hyperlink r:id="rId103">
         <w:r>
           <w:rPr>
             <w:rStyle w:val="Hyperlink"/>
@@ -19882,7 +20198,7 @@
       <w:r>
         <w:t xml:space="preserve"> </w:t>
       </w:r>
-      <w:hyperlink r:id="rId86">
+      <w:hyperlink r:id="rId104">
         <w:r>
           <w:rPr>
             <w:rStyle w:val="Hyperlink"/>
@@ -19912,7 +20228,7 @@
       <w:r>
         <w:t xml:space="preserve"> </w:t>
       </w:r>
-      <w:hyperlink r:id="rId87">
+      <w:hyperlink r:id="rId105">
         <w:r>
           <w:rPr>
             <w:rStyle w:val="Hyperlink"/>
@@ -19942,7 +20258,7 @@
       <w:r>
         <w:t xml:space="preserve"> </w:t>
       </w:r>
-      <w:hyperlink r:id="rId88">
+      <w:hyperlink r:id="rId106">
         <w:r>
           <w:rPr>
             <w:rStyle w:val="Hyperlink"/>
@@ -19972,7 +20288,7 @@
       <w:r>
         <w:t xml:space="preserve"> </w:t>
       </w:r>
-      <w:hyperlink r:id="rId89">
+      <w:hyperlink r:id="rId107">
         <w:r>
           <w:rPr>
             <w:rStyle w:val="Hyperlink"/>
@@ -20002,7 +20318,7 @@
       <w:r>
         <w:t xml:space="preserve"> </w:t>
       </w:r>
-      <w:hyperlink r:id="rId90">
+      <w:hyperlink r:id="rId108">
         <w:r>
           <w:rPr>
             <w:rStyle w:val="Hyperlink"/>
@@ -20032,7 +20348,7 @@
       <w:r>
         <w:t xml:space="preserve"> </w:t>
       </w:r>
-      <w:hyperlink r:id="rId91">
+      <w:hyperlink r:id="rId109">
         <w:r>
           <w:rPr>
             <w:rStyle w:val="Hyperlink"/>
@@ -20062,7 +20378,7 @@
       <w:r>
         <w:t xml:space="preserve"> </w:t>
       </w:r>
-      <w:hyperlink r:id="rId92">
+      <w:hyperlink r:id="rId110">
         <w:r>
           <w:rPr>
             <w:rStyle w:val="Hyperlink"/>
@@ -20092,7 +20408,7 @@
       <w:r>
         <w:t xml:space="preserve"> </w:t>
       </w:r>
-      <w:hyperlink r:id="rId93">
+      <w:hyperlink r:id="rId111">
         <w:r>
           <w:rPr>
             <w:rStyle w:val="Hyperlink"/>
@@ -20122,7 +20438,7 @@
       <w:r>
         <w:t xml:space="preserve"> </w:t>
       </w:r>
-      <w:hyperlink r:id="rId94">
+      <w:hyperlink r:id="rId112">
         <w:r>
           <w:rPr>
             <w:rStyle w:val="Hyperlink"/>
@@ -20155,7 +20471,7 @@
       <w:r>
         <w:t xml:space="preserve"> </w:t>
       </w:r>
-      <w:hyperlink r:id="rId95">
+      <w:hyperlink r:id="rId113">
         <w:r>
           <w:rPr>
             <w:rStyle w:val="Hyperlink"/>
@@ -20185,7 +20501,7 @@
       <w:r>
         <w:t xml:space="preserve"> </w:t>
       </w:r>
-      <w:hyperlink r:id="rId96">
+      <w:hyperlink r:id="rId114">
         <w:r>
           <w:rPr>
             <w:rStyle w:val="Hyperlink"/>
@@ -20215,7 +20531,7 @@
       <w:r>
         <w:t xml:space="preserve"> </w:t>
       </w:r>
-      <w:hyperlink r:id="rId97">
+      <w:hyperlink r:id="rId115">
         <w:r>
           <w:rPr>
             <w:rStyle w:val="Hyperlink"/>
@@ -20245,7 +20561,7 @@
       <w:r>
         <w:t xml:space="preserve"> </w:t>
       </w:r>
-      <w:hyperlink r:id="rId98">
+      <w:hyperlink r:id="rId116">
         <w:r>
           <w:rPr>
             <w:rStyle w:val="Hyperlink"/>
@@ -20275,7 +20591,7 @@
       <w:r>
         <w:t xml:space="preserve"> </w:t>
       </w:r>
-      <w:hyperlink r:id="rId99">
+      <w:hyperlink r:id="rId117">
         <w:r>
           <w:rPr>
             <w:rStyle w:val="Hyperlink"/>
@@ -20305,7 +20621,7 @@
       <w:r>
         <w:t xml:space="preserve"> </w:t>
       </w:r>
-      <w:hyperlink r:id="rId100">
+      <w:hyperlink r:id="rId118">
         <w:r>
           <w:rPr>
             <w:rStyle w:val="Hyperlink"/>
@@ -20335,7 +20651,7 @@
       <w:r>
         <w:t xml:space="preserve"> </w:t>
       </w:r>
-      <w:hyperlink r:id="rId101">
+      <w:hyperlink r:id="rId119">
         <w:r>
           <w:rPr>
             <w:rStyle w:val="Hyperlink"/>
@@ -20365,7 +20681,7 @@
       <w:r>
         <w:t xml:space="preserve"> </w:t>
       </w:r>
-      <w:hyperlink r:id="rId102">
+      <w:hyperlink r:id="rId120">
         <w:r>
           <w:rPr>
             <w:rStyle w:val="Hyperlink"/>
@@ -20395,7 +20711,7 @@
       <w:r>
         <w:t xml:space="preserve"> </w:t>
       </w:r>
-      <w:hyperlink r:id="rId103">
+      <w:hyperlink r:id="rId121">
         <w:r>
           <w:rPr>
             <w:rStyle w:val="Hyperlink"/>
@@ -20417,7 +20733,7 @@
           <w:iCs/>
           <w:i/>
         </w:rPr>
-        <w:t xml:space="preserve">Bulletin of Economics and Statistics, 41</w:t>
+        <w:t xml:space="preserve">Oxford Bulletin of Economics and Statistics, 41</w:t>
       </w:r>
       <w:r>
         <w:t xml:space="preserve">(4), 255–267.</w:t>
@@ -20425,7 +20741,7 @@
       <w:r>
         <w:t xml:space="preserve"> </w:t>
       </w:r>
-      <w:hyperlink r:id="rId104">
+      <w:hyperlink r:id="rId122">
         <w:r>
           <w:rPr>
             <w:rStyle w:val="Hyperlink"/>
@@ -20455,7 +20771,7 @@
       <w:r>
         <w:t xml:space="preserve"> </w:t>
       </w:r>
-      <w:hyperlink r:id="rId105">
+      <w:hyperlink r:id="rId123">
         <w:r>
           <w:rPr>
             <w:rStyle w:val="Hyperlink"/>
@@ -20485,7 +20801,7 @@
       <w:r>
         <w:t xml:space="preserve"> </w:t>
       </w:r>
-      <w:hyperlink r:id="rId106">
+      <w:hyperlink r:id="rId124">
         <w:r>
           <w:rPr>
             <w:rStyle w:val="Hyperlink"/>
@@ -20534,7 +20850,7 @@
       <w:r>
         <w:t xml:space="preserve"> </w:t>
       </w:r>
-      <w:hyperlink r:id="rId107">
+      <w:hyperlink r:id="rId125">
         <w:r>
           <w:rPr>
             <w:rStyle w:val="Hyperlink"/>
@@ -20586,7 +20902,7 @@
       <w:r>
         <w:t xml:space="preserve"> </w:t>
       </w:r>
-      <w:hyperlink r:id="rId108">
+      <w:hyperlink r:id="rId126">
         <w:r>
           <w:rPr>
             <w:rStyle w:val="Hyperlink"/>
@@ -20616,7 +20932,7 @@
       <w:r>
         <w:t xml:space="preserve"> </w:t>
       </w:r>
-      <w:hyperlink r:id="rId108">
+      <w:hyperlink r:id="rId126">
         <w:r>
           <w:rPr>
             <w:rStyle w:val="Hyperlink"/>
@@ -20646,7 +20962,7 @@
       <w:r>
         <w:t xml:space="preserve"> </w:t>
       </w:r>
-      <w:hyperlink r:id="rId108">
+      <w:hyperlink r:id="rId126">
         <w:r>
           <w:rPr>
             <w:rStyle w:val="Hyperlink"/>
@@ -20658,6 +20974,72 @@
         <w:t xml:space="preserve"> </w:t>
       </w:r>
       <w:r>
+        <w:t xml:space="preserve">World Bank. (2025b).</w:t>
+      </w:r>
+      <w:r>
+        <w:t xml:space="preserve"> </w:t>
+      </w:r>
+      <w:r>
+        <w:rPr>
+          <w:iCs/>
+          <w:i/>
+        </w:rPr>
+        <w:t xml:space="preserve">Taking stock: Vietnam economic update</w:t>
+      </w:r>
+      <w:r>
+        <w:t xml:space="preserve"> </w:t>
+      </w:r>
+      <w:r>
+        <w:t xml:space="preserve">[Biannual economic update]. World Bank Group. Retrieved May 9, 2026, from</w:t>
+      </w:r>
+      <w:r>
+        <w:t xml:space="preserve"> </w:t>
+      </w:r>
+      <w:hyperlink r:id="rId127">
+        <w:r>
+          <w:rPr>
+            <w:rStyle w:val="Hyperlink"/>
+          </w:rPr>
+          <w:t xml:space="preserve">https://www.worldbank.org/en/country/vietnam/publication/taking-stock</w:t>
+        </w:r>
+      </w:hyperlink>
+      <w:r>
+        <w:t xml:space="preserve"> </w:t>
+      </w:r>
+      <w:r>
+        <w:t xml:space="preserve">World Bank. (2025c).</w:t>
+      </w:r>
+      <w:r>
+        <w:t xml:space="preserve"> </w:t>
+      </w:r>
+      <w:r>
+        <w:rPr>
+          <w:iCs/>
+          <w:i/>
+        </w:rPr>
+        <w:t xml:space="preserve">Vietnam macroeconomic and trade indicators, 2024</w:t>
+      </w:r>
+      <w:r>
+        <w:t xml:space="preserve"> </w:t>
+      </w:r>
+      <w:r>
+        <w:t xml:space="preserve">[Data set]. World Bank Group. Retrieved May 9, 2026, from</w:t>
+      </w:r>
+      <w:r>
+        <w:t xml:space="preserve"> </w:t>
+      </w:r>
+      <w:hyperlink r:id="rId128">
+        <w:r>
+          <w:rPr>
+            <w:rStyle w:val="Hyperlink"/>
+          </w:rPr>
+          <w:t xml:space="preserve">https://data.worldbank.org/country/vietnam</w:t>
+        </w:r>
+      </w:hyperlink>
+      <w:r>
+        <w:t xml:space="preserve"> </w:t>
+      </w:r>
+      <w:r>
         <w:t xml:space="preserve">World Bank. (2026).</w:t>
       </w:r>
       <w:r>
@@ -20679,7 +21061,7 @@
       <w:r>
         <w:t xml:space="preserve"> </w:t>
       </w:r>
-      <w:hyperlink r:id="rId109">
+      <w:hyperlink r:id="rId129">
         <w:r>
           <w:rPr>
             <w:rStyle w:val="Hyperlink"/>
@@ -20709,7 +21091,7 @@
       <w:r>
         <w:t xml:space="preserve"> </w:t>
       </w:r>
-      <w:hyperlink r:id="rId110">
+      <w:hyperlink r:id="rId130">
         <w:r>
           <w:rPr>
             <w:rStyle w:val="Hyperlink"/>
@@ -20739,7 +21121,7 @@
       <w:r>
         <w:t xml:space="preserve"> </w:t>
       </w:r>
-      <w:hyperlink r:id="rId111">
+      <w:hyperlink r:id="rId131">
         <w:r>
           <w:rPr>
             <w:rStyle w:val="Hyperlink"/>
@@ -20769,7 +21151,7 @@
       <w:r>
         <w:t xml:space="preserve"> </w:t>
       </w:r>
-      <w:hyperlink r:id="rId112">
+      <w:hyperlink r:id="rId132">
         <w:r>
           <w:rPr>
             <w:rStyle w:val="Hyperlink"/>
@@ -20778,8 +21160,8 @@
         </w:r>
       </w:hyperlink>
     </w:p>
-    <w:bookmarkEnd w:id="113"/>
-    <w:bookmarkEnd w:id="114"/>
+    <w:bookmarkEnd w:id="133"/>
+    <w:bookmarkEnd w:id="134"/>
     <w:sectPr>
       <w:pgSz w:h="16838" w:w="11906"/>
       <w:pgMar w:bottom="1417" w:left="1417" w:right="1417" w:top="1417"/>

</xml_diff>

<commit_message>
docs(papers): trim all 6 abstracts to journal limits; rebuild blinded manuscripts
Trims every abstract under its target journal's limit while preserving all
retained statistics verbatim:
- P3 JABS 379->225 (structured), P4 MIR 308->194, P5 IJOEM 440->228 (structured),
  P6 IBR 386->202, P7 JIBS 345->194, P8 World Dev 238->143.
Checklist: P5 IJOEM 12/12; P4 MIR 11/12 (0 critical). Rebuilds the 6 blinded
manuscript DOCX from the trimmed sources.

https://claude.ai/code/session_01TNqoRFY1vAVQL6GWg8X9M3
</commit_message>
<xml_diff>
--- a/p3/submission/jabs_package/01_manuscript_blinded.docx
+++ b/p3/submission/jabs_package/01_manuscript_blinded.docx
@@ -140,67 +140,17 @@
         <w:pStyle w:val="FirstParagraph"/>
       </w:pPr>
       <w:r>
-        <w:t xml:space="preserve">Purpose. This study revisits the internationalisation–performance relationship in an emerging</w:t>
-      </w:r>
-      <w:r>
-        <w:t xml:space="preserve"> </w:t>
-      </w:r>
-      <w:r>
-        <w:t xml:space="preserve">market and traces how technological capability and foundational digital adoption relate to firms' productivity under conditions of institutional and digital transition. Focusing</w:t>
-      </w:r>
-      <w:r>
-        <w:t xml:space="preserve"> </w:t>
-      </w:r>
-      <w:r>
-        <w:t xml:space="preserve">on Vietnam, it asks whether export intensity is nonlinearly associated with labour productivity</w:t>
-      </w:r>
-      <w:r>
-        <w:t xml:space="preserve"> </w:t>
-      </w:r>
-      <w:r>
-        <w:t xml:space="preserve">and whether technological capability and foundational digital adoption play distinct roles across</w:t>
-      </w:r>
-      <w:r>
-        <w:t xml:space="preserve"> </w:t>
-      </w:r>
-      <w:r>
-        <w:t xml:space="preserve">survey waves.</w:t>
-      </w:r>
-      <w:r>
-        <w:t xml:space="preserve"> </w:t>
-      </w:r>
-      <w:r>
-        <w:t xml:space="preserve">Design/methodology/approach. The study uses three waves of World Bank Enterprise Survey</w:t>
-      </w:r>
-      <w:r>
-        <w:t xml:space="preserve"> </w:t>
-      </w:r>
-      <w:r>
-        <w:t xml:space="preserve">data for Vietnam (2009, 2015 and 2023; pooled N = 2,958) and estimates wave-specific and</w:t>
-      </w:r>
-      <w:r>
-        <w:t xml:space="preserve"> </w:t>
-      </w:r>
-      <w:r>
-        <w:t xml:space="preserve">pooled OLS models with HC1 robust standard errors, quadratic export-intensity terms and interaction specifications. The analysis distinguishes a Technological Capability Index based on</w:t>
-      </w:r>
-      <w:r>
-        <w:t xml:space="preserve"> </w:t>
-      </w:r>
-      <w:r>
-        <w:t xml:space="preserve">internationally recognised quality certification and foreign-licensed technology from a foundational Digital Adoption Index based on website presence, with no shared items between the two</w:t>
-      </w:r>
-      <w:r>
-        <w:t xml:space="preserve"> </w:t>
-      </w:r>
-      <w:r>
-        <w:t xml:space="preserve">constructs. Supplementary checks assess the stability of the main findings.</w:t>
-      </w:r>
-      <w:r>
-        <w:t xml:space="preserve"> </w:t>
-      </w:r>
-      <w:r>
-        <w:t xml:space="preserve">Findings, The productivity benefits of internationalisation are concentrated primarily at the participation margin — an export-participation cliff — the step from non-exporting to exporting, while within-exporter intensity yields diminishing to null marginal returns (Panel H). The full-sample inverted-U (turning points 39–46% FSTS) is identified mainly through this participation step rather than through dense curvature within the exporter subsample. Technological capability is positively associated with productivity in all three waves and in the pooled sample, and its moderating role is more stable than that of foundational digital adoption. Foundational digital adoption is positive in 2009 and 2023, null in 2015, and only shows within-sample detectable moderation in 2023. Instrumental-variable estimation (Panel K) yields a null instrumented DAI coefficient (β = 0.018, p = .942, first-stage F = 34.6), indicating that the OLS-estimated positive DAI association is likely selection-driven rather than causal.</w:t>
+        <w:rPr>
+          <w:bCs/>
+          <w:b/>
+        </w:rPr>
+        <w:t xml:space="preserve">Purpose.</w:t>
+      </w:r>
+      <w:r>
+        <w:t xml:space="preserve"> </w:t>
+      </w:r>
+      <w:r>
+        <w:t xml:space="preserve">This study revisits the internationalisation–performance relationship in Vietnam, asking whether export intensity is nonlinearly associated with labour productivity and whether technological capability and foundational digital adoption play distinct roles across survey waves.</w:t>
       </w:r>
     </w:p>
     <w:p>
@@ -208,25 +158,53 @@
         <w:pStyle w:val="BodyText"/>
       </w:pPr>
       <w:r>
-        <w:t xml:space="preserve">Originality/value. The study contributes to research on emerging markets by distinguishing</w:t>
-      </w:r>
-      <w:r>
-        <w:t xml:space="preserve"> </w:t>
-      </w:r>
-      <w:r>
-        <w:t xml:space="preserve">foreign-technology / standards capability from foundational digital adoption and by showing how</w:t>
-      </w:r>
-      <w:r>
-        <w:t xml:space="preserve"> </w:t>
-      </w:r>
-      <w:r>
-        <w:t xml:space="preserve">pooled digital effects can mask substantial temporal heterogeneity. On this evidence, the productivity relevance of basic digital adoption is context-sensitive and wave-specific</w:t>
-      </w:r>
-      <w:r>
-        <w:t xml:space="preserve"> </w:t>
-      </w:r>
-      <w:r>
-        <w:t xml:space="preserve">rather than uniformly stable across stages of internationalisation.</w:t>
+        <w:rPr>
+          <w:bCs/>
+          <w:b/>
+        </w:rPr>
+        <w:t xml:space="preserve">Design/methodology/approach.</w:t>
+      </w:r>
+      <w:r>
+        <w:t xml:space="preserve"> </w:t>
+      </w:r>
+      <w:r>
+        <w:t xml:space="preserve">Using three waves of World Bank Enterprise Survey data for Vietnam (2009, 2015, 2023; pooled N = 2,958), we estimate wave-specific and pooled OLS models with HC1 robust standard errors, quadratic export-intensity terms and interactions. A Technological Capability Index (quality certification, foreign-licensed technology) is distinguished from a foundational Digital Adoption Index (website presence), with no shared items.</w:t>
+      </w:r>
+    </w:p>
+    <w:p>
+      <w:pPr>
+        <w:pStyle w:val="BodyText"/>
+      </w:pPr>
+      <w:r>
+        <w:rPr>
+          <w:bCs/>
+          <w:b/>
+        </w:rPr>
+        <w:t xml:space="preserve">Findings.</w:t>
+      </w:r>
+      <w:r>
+        <w:t xml:space="preserve"> </w:t>
+      </w:r>
+      <w:r>
+        <w:t xml:space="preserve">Productivity benefits of internationalisation concentrate at the participation margin, an export-participation cliff from non-exporting to exporting, while within-exporter intensity yields diminishing-to-null marginal returns. The full-sample inverted-U (turning points 39–46% FSTS) is identified mainly through this participation step. Technological capability is positively associated with productivity in all waves and more stably than digital adoption, which is positive in 2009 and 2023, null in 2015, and shows detectable moderation only in 2023. Instrumental-variable estimation yields a null instrumented DAI coefficient (β = 0.018, p = .942; first-stage F = 34.6), indicating the OLS-estimated positive association is likely selection-driven.</w:t>
+      </w:r>
+    </w:p>
+    <w:p>
+      <w:pPr>
+        <w:pStyle w:val="BodyText"/>
+      </w:pPr>
+      <w:r>
+        <w:rPr>
+          <w:bCs/>
+          <w:b/>
+        </w:rPr>
+        <w:t xml:space="preserve">Originality/value.</w:t>
+      </w:r>
+      <w:r>
+        <w:t xml:space="preserve"> </w:t>
+      </w:r>
+      <w:r>
+        <w:t xml:space="preserve">By distinguishing foreign-technology / standards capability from foundational digital adoption, the study shows that pooled digital effects can mask temporal heterogeneity: the productivity relevance of basic digital adoption is context-sensitive and wave-specific rather than uniformly stable.</w:t>
       </w:r>
     </w:p>
     <w:p>

</xml_diff>

<commit_message>
fix(P3,P5): scientific deep-dive corrections (data-verified)
P3: remove the 'near-universal' overstatement for website ownership — 49.8% (the paper's
own descriptive) is near HALF, not near-universal, and at ~50% a website maximally
differentiates, so the proxy-obsolescence/hygiene-marker mechanism was self-contradictory.
Reframed to 'roughly half of firms' + flagged the reading as tentative (5 manuscripts).
P5: add 5th limitation — the durability inference rests on a non-rejection of coefficient
equality, not an equivalence test; tempered by the near-identical point estimates (TP 49.4
vs 47.2; b1 0.94 vs 1.03). Recommend a TOST equivalence test on future data (3 packages).
</commit_message>
<xml_diff>
--- a/p3/submission/jabs_package/01_manuscript_blinded.docx
+++ b/p3/submission/jabs_package/01_manuscript_blinded.docx
@@ -591,7 +591,7 @@
         <w:t xml:space="preserve">construct obsolescence under population diffusion</w:t>
       </w:r>
       <w:r>
-        <w:t xml:space="preserve">: as website ownership approaches near-universal levels, c22b functions as an organisational hygiene marker rather than a differentiating signal. The 2009 / 2015 / 2023 design cannot fully separate the two channels, and both readings are treated as legitimate within the limits of the data.</w:t>
+        <w:t xml:space="preserve">: as website ownership broadens across the firm population (though still only about half of firms by 2023), c22b may function increasingly as an organisational hygiene marker rather than a differentiating signal; with adoption only near half, this reading remains tentative. The 2009 / 2015 / 2023 design cannot fully separate the two channels, and both readings are treated as legitimate within the limits of the data.</w:t>
       </w:r>
     </w:p>
     <w:p>
@@ -965,7 +965,7 @@
         <w:pStyle w:val="BodyText"/>
       </w:pPr>
       <w:r>
-        <w:t xml:space="preserve">The 2023 wave is where the digital-moderation signal emerges most sharply. M2 again indicates a clear inverted-U (FSTS_c β = 0.962, p = .039; FSTS_c² β = -1.686, p = .008; Lind–Mehlum p = .013). In M7 both capability dimensions are positive (TCI_z β = 0.123, p = .006; DAI_z β = 0.095, p = .038). When the DAI interactions are added in M8, the linear interaction is negative and individually significant (FSTS_c × DAI_z = -0.912, p = .043), the quadratic interaction positive but not significant (FSTS_c² × DAI_z = 1.043, p = .099), and the joint test above .05 (M4 joint p = .102; M8 joint p = .062). By 2023, basic digital adoption becomes more conditional on export intensity: beyond moderate FSTS, the productivity contribution of basic digital presence attenuates. A complementary interpretation, consistent with the 2SLS null for instrumented DAI (β = 0.018, p = .942), is proxy obsolescence: website presence has become a minimum-threshold credential rather than a capability differentiator as Tier-1 adoption diffuses to near-universal levels.</w:t>
+        <w:t xml:space="preserve">The 2023 wave is where the digital-moderation signal emerges most sharply. M2 again indicates a clear inverted-U (FSTS_c β = 0.962, p = .039; FSTS_c² β = -1.686, p = .008; Lind–Mehlum p = .013). In M7 both capability dimensions are positive (TCI_z β = 0.123, p = .006; DAI_z β = 0.095, p = .038). When the DAI interactions are added in M8, the linear interaction is negative and individually significant (FSTS_c × DAI_z = -0.912, p = .043), the quadratic interaction positive but not significant (FSTS_c² × DAI_z = 1.043, p = .099), and the joint test above .05 (M4 joint p = .102; M8 joint p = .062). By 2023, basic digital adoption becomes more conditional on export intensity: beyond moderate FSTS, the productivity contribution of basic digital presence attenuates. A complementary interpretation, consistent with the 2SLS null for instrumented DAI (β = 0.018, p = .942), is proxy obsolescence: website presence has become a minimum-threshold credential rather than a capability differentiator as Tier-1 adoption diffuses to roughly half of firms.</w:t>
       </w:r>
     </w:p>
     <w:p>
@@ -1356,7 +1356,7 @@
         <w:pStyle w:val="FirstParagraph"/>
       </w:pPr>
       <w:r>
-        <w:t xml:space="preserve">This study revisits the internationalisation–performance relationship in Vietnam by treating foreign-technology / standards capability as the primary capability construct and retaining a single-item website-presence indicator only as a baseline digital-presence control, comparing pooled with wave-specific evidence across the 2009 / 2015 / 2023 WBES waves. The relationship is non-monotonic in the full sample, driven primarily by a participation-and-intensity structure rather than by strong within-exporter curvature alone, and the inverted-U turning point is structurally durable: the threshold range clusters within a narrow ~7-percentage-point band (39.3–46.2%) across 14 years of major institutional change. This durability is consistent with deep firm-level constraints (coordination capacity, contract enforcement, and trade-finance access) that change more slowly than the wider operating environment. The results also suggest that technological capability and the baseline website-presence indicator should not be treated as interchangeable: technological capability is comparatively stable and identification-robust, whereas the baseline DAI_z control is more wave-sensitive and attenuates to a null under instrumental-variable estimation, consistent with Tier-1 proxy obsolescence as website ownership diffuses to near-universal levels. Within the constraint of a single binary website indicator, the paper makes no claim about dynamic digital capability moderation; any such test awaits richer Tier 2–4 indicators not currently available cross-wave in the WBES Vietnam instrument.</w:t>
+        <w:t xml:space="preserve">This study revisits the internationalisation–performance relationship in Vietnam by treating foreign-technology / standards capability as the primary capability construct and retaining a single-item website-presence indicator only as a baseline digital-presence control, comparing pooled with wave-specific evidence across the 2009 / 2015 / 2023 WBES waves. The relationship is non-monotonic in the full sample, driven primarily by a participation-and-intensity structure rather than by strong within-exporter curvature alone, and the inverted-U turning point is structurally durable: the threshold range clusters within a narrow ~7-percentage-point band (39.3–46.2%) across 14 years of major institutional change. This durability is consistent with deep firm-level constraints (coordination capacity, contract enforcement, and trade-finance access) that change more slowly than the wider operating environment. The results also suggest that technological capability and the baseline website-presence indicator should not be treated as interchangeable: technological capability is comparatively stable and identification-robust, whereas the baseline DAI_z control is more wave-sensitive and attenuates to a null under instrumental-variable estimation, consistent with partial Tier-1 proxy obsolescence as website ownership broadens toward roughly half the firm population. Within the constraint of a single binary website indicator, the paper makes no claim about dynamic digital capability moderation; any such test awaits richer Tier 2–4 indicators not currently available cross-wave in the WBES Vietnam instrument.</w:t>
       </w:r>
     </w:p>
     <w:bookmarkEnd w:id="47"/>

</xml_diff>